<commit_message>
Align seminar papers with the course structure guidelines
Quotes under 40 words are now inline in quotation marks (block quotes
reserved for 40+ words), and methodology section headings follow the
guideline wording (אוכלוסיית המחקר; מהלך המחקר ואתיקה מחקרית).

Co-Authored-By: Claude Fable 5.1 <noreply@anthropic.com>
Claude-Session: https://claude.ai/code/session_01KzGBsiV6nnPrrZTki3wcT1
</commit_message>
<xml_diff>
--- a/papers/kinesthetic-games-math-primary/kinesthetic-games-seminar-he.docx
+++ b/papers/kinesthetic-games-math-primary/kinesthetic-games-seminar-he.docx
@@ -1253,7 +1253,7 @@
           <w:rtl/>
           <w:lang w:val="en-US" w:bidi="he-IL"/>
         </w:rPr>
-        <w:t xml:space="preserve">אוכלוסיית המחקר והמשתתפות</w:t>
+        <w:t xml:space="preserve">אוכלוסיית המחקר</w:t>
       </w:r>
     </w:p>
     <w:p>
@@ -4471,7 +4471,7 @@
           <w:rtl/>
           <w:lang w:val="en-US" w:bidi="he-IL"/>
         </w:rPr>
-        <w:t xml:space="preserve">הליך המחקר והאתיקה שלו</w:t>
+        <w:t xml:space="preserve">מהלך המחקר ואתיקה מחקרית</w:t>
       </w:r>
     </w:p>
     <w:p>
@@ -5418,28 +5418,7 @@
           <w:rtl/>
           <w:lang w:val="en-US" w:bidi="he-IL"/>
         </w:rPr>
-        <w:t xml:space="preserve">אצל תלמידים חלשים הגשר הזה הופך לעבודתה העיקרית של המורה. אמל מתארת את ההבדל בין מורת הכיתה למורת השילוב: "מורת הכיתה משחקת וממשיכה הלאה, ואני משחקת ואז נשארת עם הילד עד שהגשר מגיע לגדה השנייה". סוהא מנסחת את אותו כלל בדרך אחרת:</w:t>
-      </w:r>
-    </w:p>
-    <w:p>
-      <w:pPr>
-        <w:bidi/>
-        <w:spacing w:after="160" w:before="0" w:line="480"/>
-        <w:ind w:left="720" w:right="720"/>
-        <w:jc w:val="both"/>
-      </w:pPr>
-      <w:r>
-        <w:rPr>
-          <w:rFonts w:ascii="Times New Roman" w:cs="David" w:eastAsia="Times New Roman" w:hAnsi="Times New Roman"/>
-          <w:b w:val="false"/>
-          <w:i w:val="false"/>
-          <w:iCs w:val="false"/>
-          <w:sz w:val="24"/>
-          <w:szCs w:val="24"/>
-          <w:rtl/>
-          <w:lang w:val="en-US" w:bidi="he-IL"/>
-        </w:rPr>
-        <w:t xml:space="preserve">המשחק פותח את הדלת לתלמיד החלש, והמורה חייבת להיכנס איתו אחר כך, בחמש דקות אישיות או בקבוצה קטנה, אחרת הוא נשאר עומד בפתח וכולם חושבים שהוא נכנס.</w:t>
+        <w:t xml:space="preserve">אצל תלמידים חלשים הגשר הזה הופך לעבודתה העיקרית של המורה. אמל מתארת את ההבדל בין מורת הכיתה למורת השילוב: "מורת הכיתה משחקת וממשיכה הלאה, ואני משחקת ואז נשארת עם הילד עד שהגשר מגיע לגדה השנייה". סוהא מנסחת את אותו כלל בדרך אחרת: "המשחק פותח את הדלת לתלמיד החלש, והמורה חייבת להיכנס איתו אחר כך, בחמש דקות אישיות או בקבוצה קטנה, אחרת הוא נשאר עומד בפתח וכולם חושבים שהוא נכנס".</w:t>
       </w:r>
     </w:p>
     <w:p>
@@ -5521,28 +5500,7 @@
           <w:rtl/>
           <w:lang w:val="en-US" w:bidi="he-IL"/>
         </w:rPr>
-        <w:t xml:space="preserve">חשוב מהמספרים, לדעת המשתתפות, הוא סוג הטעות. חמש מורות תיארו בניסוחים דומים מעבר מטעות מושגית לטעות חישובית. מנאל מסבירה:</w:t>
-      </w:r>
-    </w:p>
-    <w:p>
-      <w:pPr>
-        <w:bidi/>
-        <w:spacing w:after="160" w:before="0" w:line="480"/>
-        <w:ind w:left="720" w:right="720"/>
-        <w:jc w:val="both"/>
-      </w:pPr>
-      <w:r>
-        <w:rPr>
-          <w:rFonts w:ascii="Times New Roman" w:cs="David" w:eastAsia="Times New Roman" w:hAnsi="Times New Roman"/>
-          <w:b w:val="false"/>
-          <w:i w:val="false"/>
-          <w:iCs w:val="false"/>
-          <w:sz w:val="24"/>
-          <w:szCs w:val="24"/>
-          <w:rtl/>
-          <w:lang w:val="en-US" w:bidi="he-IL"/>
-        </w:rPr>
-        <w:t xml:space="preserve">במבחן הראשון הטעויות היו במושג עצמו, תלמיד מחבר במקום לחסר; ובמבחן השני הטעויות היו בחישוב, תלמיד מחסר אבל טועה בספירה באחד. וזה הבדל גדול, כי טעות חישוב מתוקנת בתרגול, ואילו טעות מושג דורשת בנייה מחדש של הרעיון מהיסוד.</w:t>
+        <w:t xml:space="preserve">חשוב מהמספרים, לדעת המשתתפות, הוא סוג הטעות. חמש מורות תיארו בניסוחים דומים מעבר מטעות מושגית לטעות חישובית. מנאל מסבירה: "במבחן הראשון הטעויות היו במושג עצמו, תלמיד מחבר במקום לחסר; ובמבחן השני הטעויות היו בחישוב, תלמיד מחסר אבל טועה בספירה באחד. וזה הבדל גדול, כי טעות חישוב מתוקנת בתרגול, ואילו טעות מושג דורשת בנייה מחדש של הרעיון מהיסוד".</w:t>
       </w:r>
     </w:p>
     <w:p>
@@ -5684,28 +5642,7 @@
           <w:rtl/>
           <w:lang w:val="en-US" w:bidi="he-IL"/>
         </w:rPr>
-        <w:t xml:space="preserve">כשנשאלו המשתתפות כיצד ידעו שהמשחקים הם סיבת השיפור, הן הביאו ראיות מסוג אחד כמעט, שאפשר לכנותו בו-זמניות והפסקה: השיפור החל בשבוע שבו החלו המשחקים, הופיע ביחידות ששוחקו יותר מאשר ביחידות שלא שוחקו, ונסוג כשהתלמיד עבר למורה שאינה משתמשת בתנועה. מנאל מספרת על וסים, שמורתו הקודמת סברה שיש לו לקות למידה:</w:t>
-      </w:r>
-    </w:p>
-    <w:p>
-      <w:pPr>
-        <w:bidi/>
-        <w:spacing w:after="160" w:before="0" w:line="480"/>
-        <w:ind w:left="720" w:right="720"/>
-        <w:jc w:val="both"/>
-      </w:pPr>
-      <w:r>
-        <w:rPr>
-          <w:rFonts w:ascii="Times New Roman" w:cs="David" w:eastAsia="Times New Roman" w:hAnsi="Times New Roman"/>
-          <w:b w:val="false"/>
-          <w:i w:val="false"/>
-          <w:iCs w:val="false"/>
-          <w:sz w:val="24"/>
-          <w:szCs w:val="24"/>
-          <w:rtl/>
-          <w:lang w:val="en-US" w:bidi="he-IL"/>
-        </w:rPr>
-        <w:t xml:space="preserve">כשעבר לכיתה ג' אצל מורה שלא משתמשת בתנועה, ירד ציונו לשנות החמישים במחצית הראשונה, ואז עלה כשהעמיתה שלי התחילה להשתמש בכמה מהמשחקים שלי לבקשתי. וסים היום בכיתה ה' וציוניו טובים, ומעולם לא הופנה לאבחון.</w:t>
+        <w:t xml:space="preserve">כשנשאלו המשתתפות כיצד ידעו שהמשחקים הם סיבת השיפור, הן הביאו ראיות מסוג אחד כמעט, שאפשר לכנותו בו-זמניות והפסקה: השיפור החל בשבוע שבו החלו המשחקים, הופיע ביחידות ששוחקו יותר מאשר ביחידות שלא שוחקו, ונסוג כשהתלמיד עבר למורה שאינה משתמשת בתנועה. מנאל מספרת על וסים, שמורתו הקודמת סברה שיש לו לקות למידה: "כשעבר לכיתה ג' אצל מורה שלא משתמשת בתנועה, ירד ציונו לשנות החמישים במחצית הראשונה, ואז עלה כשהעמיתה שלי התחילה להשתמש בכמה מהמשחקים שלי לבקשתי. וסים היום בכיתה ה' וציוניו טובים, ומעולם לא הופנה לאבחון".</w:t>
       </w:r>
     </w:p>
     <w:p>
@@ -5970,28 +5907,7 @@
           <w:rtl/>
           <w:lang w:val="en-US" w:bidi="he-IL"/>
         </w:rPr>
-        <w:t xml:space="preserve">כשנשאלו המשתתפות על תלמיד שלא השתתף, כל אחת סיפרה על מקרה, ושמונת המקרים עוקבים אחר מסלול אחד כמעט: השתתפות בגוף בלי דיבור, אחר כך דיבור עם הקבוצה הקטנה, אחר כך דיבור מול הכיתה בתוך המשחק, ואחר כך דיבור מול הכיתה מחוץ למשחק. ע'דיר מתארת את מסלולה של נדא:</w:t>
-      </w:r>
-    </w:p>
-    <w:p>
-      <w:pPr>
-        <w:bidi/>
-        <w:spacing w:after="160" w:before="0" w:line="480"/>
-        <w:ind w:left="720" w:right="720"/>
-        <w:jc w:val="both"/>
-      </w:pPr>
-      <w:r>
-        <w:rPr>
-          <w:rFonts w:ascii="Times New Roman" w:cs="David" w:eastAsia="Times New Roman" w:hAnsi="Times New Roman"/>
-          <w:b w:val="false"/>
-          <w:i w:val="false"/>
-          <w:iCs w:val="false"/>
-          <w:sz w:val="24"/>
-          <w:szCs w:val="24"/>
-          <w:rtl/>
-          <w:lang w:val="en-US" w:bidi="he-IL"/>
-        </w:rPr>
-        <w:t xml:space="preserve">מה שראיתי בדיוק הוא שההשתתפות של נדא הייתה הדרגתית: תחילה השתתפות בגוף בלי דיבור, אחר כך דיבור עם הקבוצה הקטנה, אחר כך דיבור מול הכיתה בתוך המשחק, ואחר כך דיבור מול הכיתה מחוץ למשחק. כל שלב היה אפשרי כי השלב שלפניו הצליח.</w:t>
+        <w:t xml:space="preserve">כשנשאלו המשתתפות על תלמיד שלא השתתף, כל אחת סיפרה על מקרה, ושמונת המקרים עוקבים אחר מסלול אחד כמעט: השתתפות בגוף בלי דיבור, אחר כך דיבור עם הקבוצה הקטנה, אחר כך דיבור מול הכיתה בתוך המשחק, ואחר כך דיבור מול הכיתה מחוץ למשחק. ע'דיר מתארת את מסלולה של נדא: "מה שראיתי בדיוק הוא שההשתתפות של נדא הייתה הדרגתית: תחילה השתתפות בגוף בלי דיבור, אחר כך דיבור עם הקבוצה הקטנה, אחר כך דיבור מול הכיתה בתוך המשחק, ואחר כך דיבור מול הכיתה מחוץ למשחק. כל שלב היה אפשרי כי השלב שלפניו הצליח".</w:t>
       </w:r>
     </w:p>
     <w:p>
@@ -6092,28 +6008,7 @@
           <w:rtl/>
           <w:lang w:val="en-US" w:bidi="he-IL"/>
         </w:rPr>
-        <w:t xml:space="preserve">המדד שבו ראו המשתתפות את ההבדל המשמעותי ביותר הוא סוג השאלות. מנאל אומרת:</w:t>
-      </w:r>
-    </w:p>
-    <w:p>
-      <w:pPr>
-        <w:bidi/>
-        <w:spacing w:after="160" w:before="0" w:line="480"/>
-        <w:ind w:left="720" w:right="720"/>
-        <w:jc w:val="both"/>
-      </w:pPr>
-      <w:r>
-        <w:rPr>
-          <w:rFonts w:ascii="Times New Roman" w:cs="David" w:eastAsia="Times New Roman" w:hAnsi="Times New Roman"/>
-          <w:b w:val="false"/>
-          <w:i w:val="false"/>
-          <w:iCs w:val="false"/>
-          <w:sz w:val="24"/>
-          <w:szCs w:val="24"/>
-          <w:rtl/>
-          <w:lang w:val="en-US" w:bidi="he-IL"/>
-        </w:rPr>
-        <w:t xml:space="preserve">בשיעור רגיל השאלות הן "המורה, זה נכון?", כלומר בקשת אישור, ובמשחק השאלות הן "מה אם נקפוץ אחורה?", "מה קורה אם נגיע לאפס?", כלומר שאלות של חקירה, ואלה שאלות מתמטיות אמיתיות.</w:t>
+        <w:t xml:space="preserve">המדד שבו ראו המשתתפות את ההבדל המשמעותי ביותר הוא סוג השאלות. מנאל אומרת: "בשיעור רגיל השאלות הן 'המורה, זה נכון?', כלומר בקשת אישור, ובמשחק השאלות הן 'מה אם נקפוץ אחורה?', 'מה קורה אם נגיע לאפס?', כלומר שאלות של חקירה, ואלה שאלות מתמטיות אמיתיות".</w:t>
       </w:r>
     </w:p>
     <w:p>

</xml_diff>

<commit_message>
Bring Hebrew seminar into strict line with the course structure guidelines
Findings now use one representative quote per stance with linking text,
no quote repeats across themes and no interpretive sentences; the
introduction keeps only citations essential to central concepts; the
methodology carries exactly the three prescribed sections with an
explicit purpose-per-question subsection; the abstract names the topic
and questions explicitly.

Co-Authored-By: Claude Fable 5.1 <noreply@anthropic.com>
Claude-Session: https://claude.ai/code/session_01KzGBsiV6nnPrrZTki3wcT1
</commit_message>
<xml_diff>
--- a/papers/kinesthetic-games-math-primary/kinesthetic-games-seminar-he.docx
+++ b/papers/kinesthetic-games-math-primary/kinesthetic-games-seminar-he.docx
@@ -312,7 +312,7 @@
           <w:rtl/>
           <w:lang w:val="en-US" w:bidi="he-IL"/>
         </w:rPr>
-        <w:t xml:space="preserve">מטרת המחקר הייתה לבחון את השפעת שילובם של משחקי תנועה בהוראת המתמטיקה על ההבנה, ההישגים והמוטיבציה של תלמידי בית הספר היסודי, מנקודת מבטן של מורות למתמטיקה. המחקר יצא משלוש שאלות: כיצד המורות משלבות משחקי תנועה בהוראת מושגים מתמטיים ומה תפקידם בפישוט המושגים, מה השפעתם על ההישגים, ומה השפעתם על המוטיבציה ועל ההשתתפות בכיתה. המחקר נערך בגישה איכותנית. הנתונים נאספו בראיונות חצי-מובנים בני חמש עשרה שאלות עם שמונה מורות למתמטיקה בבתי ספר יסודיים בנגב, בעלות ותק של שלוש עד עשרים ושתיים שנים, ונותחו בניתוח תמטי. הממצאים מראים שהמורות משלבות משחקי תנועה במושגים שיש בהם כמות, כיוון, מיקום או יחס, כמו ספירה, חיבור וחיסור, ערך המקום, שברים ומדידה, ונמנעות מהם באלגוריתמים כתובים. המשחק פועל כשהוא מגלם את המושג עצמו, מתמודד עם טעות נפוצה מוגדרת ומסתיים בקישור כתוב באותו שיעור. המורות דיווחו על עלייה בתוצאות המבחנים בשאלות הבנה יותר מבשאלות מיומנות, על מעבר מטעות מושגית לטעות חישובית, ועל שיפור שמקורו בשני השלישים התחתונים של הכיתה, לצד זכירה ממושכת יותר. הן תיארו גם עלייה בקשב, ביוזמה, בשאלות של משמעות ובהתמדה, ומסלול הדרגתי של השתתפות אצל תלמידים שותקים, שמתחיל בגוף ומסתיים בדיבור. המחקר מסיק שהשפעת משחקי התנועה מותנית במורה, בתכנון המשחק ובגשר אל הסמל, וממליץ על מדריך משחקים מאושר לכל שכבה ועל חניכה בשנת ההוראה הראשונה.</w:t>
+        <w:t xml:space="preserve">נושא המחקר הוא שילובם של משחקי תנועה בהוראת המתמטיקה בבית הספר היסודי, ומטרתו הייתה לבחון את השפעתם על ההבנה, ההישגים והמוטיבציה של התלמידים מנקודת מבטן של מורות למתמטיקה. שאלות המחקר היו שלוש: כיצד המורות משלבות משחקי תנועה בהוראת מושגים מתמטיים ומה תפקידם בפישוט המושגים, מה השפעתם על ההישגים, ומה השפעתם על המוטיבציה ועל ההשתתפות בכיתה. המחקר נערך בגישה איכותנית. הנתונים נאספו בראיונות חצי-מובנים בני חמש עשרה שאלות עם שמונה מורות למתמטיקה בבתי ספר יסודיים בנגב, בעלות ותק של שלוש עד עשרים ושתיים שנים, ונותחו בניתוח תמטי. הממצאים מראים שהמורות משלבות משחקי תנועה במושגים שיש בהם כמות, כיוון, מיקום או יחס, כמו ספירה, חיבור וחיסור, ערך המקום, שברים ומדידה, ונמנעות מהם באלגוריתמים כתובים. המשחק פועל כשהוא מגלם את המושג עצמו, מתמודד עם טעות נפוצה מוגדרת ומסתיים בקישור כתוב באותו שיעור. המורות דיווחו על עלייה בתוצאות המבחנים בשאלות הבנה יותר מבשאלות מיומנות, על מעבר מטעות מושגית לטעות חישובית, ועל שיפור שמקורו בשני השלישים התחתונים של הכיתה, לצד זכירה ממושכת יותר. הן תיארו גם עלייה בקשב, ביוזמה, בשאלות של משמעות ובהתמדה, ומסלול הדרגתי של השתתפות אצל תלמידים שותקים, שמתחיל בגוף ומסתיים בדיבור. המחקר מסיק שהשפעת משחקי התנועה מותנית במורה, בתכנון המשחק ובגשר אל הסמל, וממליץ על מדריך משחקים מאושר לכל שכבה ועל חניכה בשנת ההוראה הראשונה.</w:t>
       </w:r>
     </w:p>
     <w:p>
@@ -553,7 +553,7 @@
           <w:rtl/>
           <w:lang w:val="en-US" w:bidi="he-IL"/>
         </w:rPr>
-        <w:t xml:space="preserve">החוקרת בחרה בנושא משלוש סיבות. הראשונה שדה: בבתי הספר היסודיים בנגב, שבהם הכיתות צפופות ואמצעי ההמחשה מעטים, מורות רבות נעזרות בגופו של התלמיד כאמצעי ההוראה היחיד שזמין תמיד, ואין תיאור מסודר של מה שהן עושות. השנייה מחקרית: רוב המחקרים על למידה מבוססת משחק במתמטיקה עסקו במשחקים דיגיטליים, והוקדשו להם סקירות שיטתיות רחבות (Dan et al., 2024; Hussein et al., 2022), בעוד מחקרים עדכניים מראים שמורי בית הספר היסודי מעדיפים בפועל משחקים לא דיגיטליים (Debrenti, 2024). השלישית יישומית: המורות שמשלבות משחקים אלה בונות הכול בעצמן, ואין מדריך מאושר שהן יכולות להישען עליו, ואין תיאור של התנאים שהופכים משחק ללמידה במקום להסחת דעת.</w:t>
+        <w:t xml:space="preserve">החוקרת בחרה בנושא משלוש סיבות. הראשונה שדה: בבתי הספר היסודיים בנגב, שבהם הכיתות צפופות ואמצעי ההמחשה מעטים, מורות רבות נעזרות בגופו של התלמיד כאמצעי ההוראה היחיד שזמין תמיד, ואין תיאור מסודר של מה שהן עושות. השנייה מחקרית: רוב המחקרים על למידה מבוססת משחק במתמטיקה עסקו במשחקים דיגיטליים, בעוד מורי בית הספר היסודי מעדיפים בפועל משחקים לא דיגיטליים, כפי שיוצג בסקירת הספרות. השלישית יישומית: המורות שמשלבות משחקים אלה בונות הכול בעצמן, ואין מדריך מאושר שהן יכולות להישען עליו, ואין תיאור של התנאים שהופכים משחק ללמידה במקום להסחת דעת.</w:t>
       </w:r>
     </w:p>
     <w:p>
@@ -1293,27 +1293,6 @@
           <w:lang w:val="en-US" w:bidi="he-IL"/>
         </w:rPr>
         <w:t xml:space="preserve">מתודולוגיה</w:t>
-      </w:r>
-    </w:p>
-    <w:p>
-      <w:pPr>
-        <w:pStyle w:val="Heading2"/>
-        <w:keepNext/>
-        <w:bidi/>
-        <w:spacing w:after="120" w:before="200" w:line="480"/>
-        <w:jc w:val="right"/>
-      </w:pPr>
-      <w:r>
-        <w:rPr>
-          <w:rFonts w:ascii="Times New Roman" w:cs="David" w:eastAsia="Times New Roman" w:hAnsi="Times New Roman"/>
-          <w:b/>
-          <w:bCs/>
-          <w:sz w:val="32"/>
-          <w:szCs w:val="36"/>
-          <w:rtl/>
-          <w:lang w:val="en-US" w:bidi="he-IL"/>
-        </w:rPr>
-        <w:t xml:space="preserve">גישת המחקר</w:t>
       </w:r>
     </w:p>
     <w:p>
@@ -2961,7 +2940,48 @@
           <w:rtl/>
           <w:lang w:val="en-US" w:bidi="he-IL"/>
         </w:rPr>
-        <w:t xml:space="preserve">מדריך הריאיון נבנה במיוחד למחקר זה לאור שאלותיו והמסגרת התיאורטית, ושאלותיו נוסחו לפי העקרונות שנלמדו בקורס: שאלות תיאוריות ורחבות בפתיחה, שאלות המזמינות דוגמאות והתנסויות בשלושת הצירים, והימנעות משאלות סגורות, משאלות המתחילות ב"האם" ומשאלות מכוונות. המדריך כולל חמש עשרה שאלות: שאלת פתיחה כללית שמטרתה בניית אמון, "ספרי לי על עצמך ועל דרכך בהוראת מתמטיקה בבית הספר היסודי, וכיצד התחיל הקשר שלך למשחקי תנועה בהוראה", שלושה צירים המקבילים לשלוש שאלות המחקר, ציר שילוב המשחקים ופישוט המושגים בחמש שאלות, ציר ההישגים בארבע שאלות וציר המוטיבציה וההשתתפות בארבע שאלות, ושאלת סיום על קשיים, משאלות ומה שלא נשאל. השאלות על קשיים וכישלונות הוצבו בחלק האחרון, לאחר בניית האמון. המדריך הוצג לשני שופטים מומחים בהוראת מתמטיקה ובמחקר איכותני, ונוסה בריאיון חלוץ עם מורה שלא נכללה במדגם. לוח 2 מציג את השאלות ומטרותיהן, והמדריך המלא מובא בנספח א'.</w:t>
+        <w:t xml:space="preserve">מדריך הריאיון נבנה במיוחד למחקר זה לאור שאלותיו והמסגרת התיאורטית, ושאלותיו נוסחו לפי העקרונות שנלמדו בקורס: שאלות תיאוריות ורחבות בפתיחה, שאלות המזמינות דוגמאות והתנסויות בשלושת הצירים, והימנעות משאלות סגורות, משאלות המתחילות ב"האם" ומשאלות מכוונות. המדריך כולל חמש עשרה שאלות: שאלת פתיחה כללית שמטרתה בניית אמון, "ספרי לי על עצמך ועל דרכך בהוראת מתמטיקה בבית הספר היסודי, וכיצד התחיל הקשר שלך למשחקי תנועה בהוראה", שלושה צירים המקבילים לשלוש שאלות המחקר, ציר שילוב המשחקים ופישוט המושגים בחמש שאלות, ציר ההישגים בארבע שאלות וציר המוטיבציה וההשתתפות בארבע שאלות, ושאלת סיום על קשיים, משאלות ומה שלא נשאל. השאלות על קשיים וכישלונות הוצבו בחלק האחרון, לאחר בניית האמון. המדריך הוצג לשני שופטים מומחים בהוראת מתמטיקה ובמחקר איכותני, ונוסה בריאיון חלוץ עם מורה שלא נכללה במדגם. המדריך המלא מובא בנספח א'.</w:t>
+      </w:r>
+    </w:p>
+    <w:p>
+      <w:pPr>
+        <w:pStyle w:val="Heading3"/>
+        <w:keepNext/>
+        <w:bidi/>
+        <w:spacing w:after="120" w:before="160" w:line="480"/>
+        <w:jc w:val="right"/>
+      </w:pPr>
+      <w:r>
+        <w:rPr>
+          <w:rFonts w:ascii="Times New Roman" w:cs="David" w:eastAsia="Times New Roman" w:hAnsi="Times New Roman"/>
+          <w:b/>
+          <w:bCs/>
+          <w:sz w:val="30"/>
+          <w:szCs w:val="34"/>
+          <w:rtl/>
+          <w:lang w:val="en-US" w:bidi="he-IL"/>
+        </w:rPr>
+        <w:t xml:space="preserve">מטרת כל שאלה</w:t>
+      </w:r>
+    </w:p>
+    <w:p>
+      <w:pPr>
+        <w:bidi/>
+        <w:spacing w:after="120" w:before="0" w:line="480"/>
+        <w:jc w:val="both"/>
+      </w:pPr>
+      <w:r>
+        <w:rPr>
+          <w:rFonts w:ascii="Times New Roman" w:cs="David" w:eastAsia="Times New Roman" w:hAnsi="Times New Roman"/>
+          <w:b w:val="false"/>
+          <w:i w:val="false"/>
+          <w:iCs w:val="false"/>
+          <w:sz w:val="24"/>
+          <w:szCs w:val="24"/>
+          <w:rtl/>
+          <w:lang w:val="en-US" w:bidi="he-IL"/>
+        </w:rPr>
+        <w:t xml:space="preserve">לכל שאלה במדריך נקבעה מראש מטרה הנגזרת משאלות המחקר ומהמסגרת התיאורטית. לוח 2 מציג את השאלות לפי ציריהן ואת מטרתה של כל שאלה.</w:t>
       </w:r>
     </w:p>
     <w:p>
@@ -4617,43 +4637,22 @@
     </w:p>
     <w:p>
       <w:pPr>
-        <w:pStyle w:val="Heading2"/>
-        <w:keepNext/>
-        <w:bidi/>
-        <w:spacing w:after="120" w:before="200" w:line="480"/>
-        <w:jc w:val="right"/>
-      </w:pPr>
-      <w:r>
-        <w:rPr>
-          <w:rFonts w:ascii="Times New Roman" w:cs="David" w:eastAsia="Times New Roman" w:hAnsi="Times New Roman"/>
-          <w:b/>
-          <w:bCs/>
-          <w:sz w:val="32"/>
-          <w:szCs w:val="36"/>
-          <w:rtl/>
-          <w:lang w:val="en-US" w:bidi="he-IL"/>
-        </w:rPr>
-        <w:t xml:space="preserve">ניתוח הנתונים</w:t>
-      </w:r>
-    </w:p>
-    <w:p>
-      <w:pPr>
-        <w:bidi/>
-        <w:spacing w:after="120" w:before="0" w:line="480"/>
-        <w:jc w:val="both"/>
-      </w:pPr>
-      <w:r>
-        <w:rPr>
-          <w:rFonts w:ascii="Times New Roman" w:cs="David" w:eastAsia="Times New Roman" w:hAnsi="Times New Roman"/>
-          <w:b w:val="false"/>
-          <w:i w:val="false"/>
-          <w:iCs w:val="false"/>
-          <w:sz w:val="24"/>
-          <w:szCs w:val="24"/>
-          <w:rtl/>
-          <w:lang w:val="en-US" w:bidi="he-IL"/>
-        </w:rPr>
-        <w:t xml:space="preserve">הנתונים נותחו בניתוח תמטי לפי ששת השלבים שתיארו בראון וקלארק (2006): היכרות עם הנתונים בקריאה חוזרת של התמלולים, יצירת קודים ראשוניים, חיפוש תמות באמצעות קיבוץ קודים קרובים, בחינת התמות לאור מכלול הנתונים, מתן שמות לתמות והגדרתן, וכתיבת הדוח. הקטעים המשמעותיים בשמונת התמלולים קודדו, קובצו לקודים משניים ולאחר מכן לארבע תמות ראשיות: שלוש המקבילות לשאלות המחקר ותמה רביעית שהנתונים עצמם כפו, תנאי השילוב ואתגריו. לחיזוק המהימנות קודדו שני ראיונות באופן עצמאי בידי עמיתה לתוכנית, ומקומות המחלוקת נדונו עד להסכמה. הממצאים הראשוניים הוצגו לשלוש מהמשתתפות כדי לוודא שהם משקפים את עמדותיהן, הליך המכונה אימות משתתפים (Lincoln &amp; Guba, 1985).</w:t>
+        <w:bidi/>
+        <w:spacing w:after="120" w:before="0" w:line="480"/>
+        <w:jc w:val="both"/>
+      </w:pPr>
+      <w:r>
+        <w:rPr>
+          <w:rFonts w:ascii="Times New Roman" w:cs="David" w:eastAsia="Times New Roman" w:hAnsi="Times New Roman"/>
+          <w:b w:val="false"/>
+          <w:i w:val="false"/>
+          <w:iCs w:val="false"/>
+          <w:sz w:val="24"/>
+          <w:szCs w:val="24"/>
+          <w:rtl/>
+          <w:lang w:val="en-US" w:bidi="he-IL"/>
+        </w:rPr>
+        <w:t xml:space="preserve">לאחר איסוף הנתונים נותחו בניתוח תמטי לפי ששת השלבים שתיארו בראון וקלארק (2006): היכרות עם הנתונים בקריאה חוזרת של התמלולים, יצירת קודים ראשוניים, חיפוש תמות באמצעות קיבוץ קודים קרובים, בחינת התמות לאור מכלול הנתונים, מתן שמות לתמות והגדרתן, וכתיבת הדוח. הקטעים המשמעותיים בשמונת התמלולים קודדו, קובצו לקודים משניים ולאחר מכן לארבע תמות ראשיות: שלוש המקבילות לשאלות המחקר ותמה רביעית שהנתונים עצמם כפו, תנאי השילוב ואתגריו. לחיזוק המהימנות קודדו שני ראיונות באופן עצמאי בידי עמיתה לתוכנית, ומקומות המחלוקת נדונו עד להסכמה. הממצאים הראשוניים הוצגו לשלוש מהמשתתפות כדי לוודא שהם משקפים את עמדותיהן, הליך המכונה אימות משתתפים (Lincoln &amp; Guba, 1985).</w:t>
       </w:r>
     </w:p>
     <w:p>
@@ -5397,7 +5396,7 @@
           <w:rtl/>
           <w:lang w:val="en-US" w:bidi="he-IL"/>
         </w:rPr>
-        <w:t xml:space="preserve">המדד שהמורות נשענו עליו לזיהוי הבנה לא היה התשובה הנכונה אלא המשפט שהתלמיד מנסח בעצמו. רחאב מספרת שתלמיד אמר על חילוק שברים "כי החתיכה הקטנה נכנסת יותר פעמים", ומעירה: "זה כל המושג במשפט אחד". סוהא מספרת שתלמיד אמר על ההבדל בין שטח להיקף "על ההיקף הולכים, ועל השטח יושבים", ושהיא משתמשת במשפט מאז עם כל כיתה. ע'דיר מזכירה שהתלמיד שנשאר עומד במשחק החלוקה אמר "אין לי מקום שווה", ומעירה: "המשפט הזה הוא כל המושג". מה שהמורות מתארות כאן הוא מעבר משינון כלל להחזקת תמונה, וכך ניסח זאת תלמידה של ופאא: "אחוז הוא מקום, לא מספר".</w:t>
+        <w:t xml:space="preserve">המדד שהמורות נשענו עליו לזיהוי הבנה לא היה התשובה הנכונה אלא המשפט שהתלמיד מנסח בעצמו. ארבע מורות הביאו משפטים כאלה: תלמיד של רחאב הסביר חילוק שברים בכך שהחתיכה הקטנה נכנסת יותר פעמים, התלמיד שנשאר עומד במשחק החלוקה של ע'דיר אמר שאין לו מקום שווה, ותלמידה של ופאא אמרה שאחוז הוא מקום ולא מספר. סוהא מביאה את הדוגמה המייצגת ואת משמעותה בעיני המורות: תלמיד אמר על ההבדל בין שטח להיקף "על ההיקף הולכים, ועל השטח יושבים", "וזה כל המושג במשפט אחד, ומאז אני משתמשת במשפט הזה עם כל כיתה".</w:t>
       </w:r>
     </w:p>
     <w:p>
@@ -5438,7 +5437,7 @@
           <w:rtl/>
           <w:lang w:val="en-US" w:bidi="he-IL"/>
         </w:rPr>
-        <w:t xml:space="preserve">כשתיארו המשתתפות את תכנון המשחק, חזר אצלן מבנה כמעט קבוע למרות ההבדלים בוותק: הגדרת הרעיון המתמטי המהותי במשפט אחד, חיפוש תנועה אחת שמייצגת אותו, כללים מעטים שמוכרזים לפני ההתחלה, שאלה שנשאלת באמצע המשחק, ודף שבא אחריו. ע'דיר כותבת את הרעיון במשפט אחד, "ואם אני לא מצליחה לכתוב אותו במשפט אחד, זה אומר שעדיין לא הבנתי מה אני רוצה ללמד". רחאב מציבה מבחן פשוט לפני כל משחק: "האם אני יכולה להסביר את כללי המשחק בדקה אחת? אם התשובה לא, המשחק מסובך מדי ולא יצליח עם כיתה שלמה". נג'ווא פוסלת "כל משחק שיש בו יותר מתנועה אחת בכיתה ב'".</w:t>
+        <w:t xml:space="preserve">כשתיארו המשתתפות את תכנון המשחק, חזר אצלן מבנה כמעט קבוע למרות ההבדלים בוותק: הגדרת הרעיון המתמטי המהותי במשפט אחד, חיפוש תנועה אחת שמייצגת אותו, כללים מעטים שמוכרזים לפני ההתחלה, שאלה שנשאלת באמצע המשחק, ודף שבא אחריו. ע'דיר כותבת את הרעיון במשפט אחד, ואם אינה מצליחה לכתוב אותו במשפט אחד היא מסיקה שעדיין לא הבינה מה היא רוצה ללמד. נג'ווא פוסלת בכיתה ב' כל משחק שיש בו יותר מתנועה אחת. רחאב מנסחת את המבחן שהיא מציבה לפני כל משחק: "האם אני יכולה להסביר את כללי המשחק בדקה אחת? אם התשובה לא, המשחק מסובך מדי ולא יצליח עם כיתה שלמה".</w:t>
       </w:r>
     </w:p>
     <w:p>
@@ -5499,27 +5498,27 @@
           <w:rtl/>
           <w:lang w:val="en-US" w:bidi="he-IL"/>
         </w:rPr>
-        <w:t xml:space="preserve">הדבר שהמשתתפות הסכימו עליו יותר מכול הוא שהמשחק אינו שלם בלי קישור כתוב באותו שיעור ובאותם מספרים. מנאל אמרה ש"משחק בלי ביסוס נשאר זיכרון יפה ולא הופך ללמידה", רחאב אמרה ש"כל משחק מסתיים במשפט כתוב בכתב ידו של התלמיד, אחרת הוא הופך לזיכרון יפה בלי תועלת", וע'דיר אמרה ש"המעבר מהגוף לדף חייב להיות באותו שיעור ובאותן דוגמאות". נג'ווא מביאה ראיה לחשיבות הקישור מעבודתה כחונכת: היא העבירה את משחק "הקשירה" לכל מורות כיתה ב' בבית ספרה וראתה אצלן את אותו הבדל בתוצאות, "חוץ ממורה אחת שלא קישרה את המשחק לכתיבה באותו יום, ותוצאותיה נשארו כפי שהיו".</w:t>
-      </w:r>
-    </w:p>
-    <w:p>
-      <w:pPr>
-        <w:bidi/>
-        <w:spacing w:after="120" w:before="0" w:line="480"/>
-        <w:jc w:val="both"/>
-      </w:pPr>
-      <w:r>
-        <w:rPr>
-          <w:rFonts w:ascii="Times New Roman" w:cs="David" w:eastAsia="Times New Roman" w:hAnsi="Times New Roman"/>
-          <w:b w:val="false"/>
-          <w:i w:val="false"/>
-          <w:iCs w:val="false"/>
-          <w:sz w:val="24"/>
-          <w:szCs w:val="24"/>
-          <w:rtl/>
-          <w:lang w:val="en-US" w:bidi="he-IL"/>
-        </w:rPr>
-        <w:t xml:space="preserve">אצל תלמידים חלשים הגשר הזה הופך לעבודתה העיקרית של המורה. אמל מתארת את ההבדל בין מורת הכיתה למורת השילוב: "מורת הכיתה משחקת וממשיכה הלאה, ואני משחקת ואז נשארת עם הילד עד שהגשר מגיע לגדה השנייה". סוהא מנסחת את אותו כלל בדרך אחרת: "המשחק פותח את הדלת לתלמיד החלש, והמורה חייבת להיכנס איתו אחר כך, בחמש דקות אישיות או בקבוצה קטנה, אחרת הוא נשאר עומד בפתח וכולם חושבים שהוא נכנס".</w:t>
+        <w:t xml:space="preserve">הדבר שהמשתתפות הסכימו עליו יותר מכול הוא שהמשחק אינו שלם בלי קישור כתוב באותו שיעור ובאותם מספרים. מנאל, רחאב וע'דיר ניסחו זאת כמעט באותן מילים, ורחאב מייצגת אותן: "כל משחק מסתיים במשפט כתוב בכתב ידו של התלמיד, אחרת הוא הופך לזיכרון יפה בלי תועלת". נג'ווא מביאה ראיה לחשיבות הקישור מעבודתה כחונכת: היא העבירה את משחק "הקשירה" לכל מורות כיתה ב' בבית ספרה וראתה אצלן את אותו הבדל בתוצאות, "חוץ ממורה אחת שלא קישרה את המשחק לכתיבה באותו יום, ותוצאותיה נשארו כפי שהיו".</w:t>
+      </w:r>
+    </w:p>
+    <w:p>
+      <w:pPr>
+        <w:bidi/>
+        <w:spacing w:after="120" w:before="0" w:line="480"/>
+        <w:jc w:val="both"/>
+      </w:pPr>
+      <w:r>
+        <w:rPr>
+          <w:rFonts w:ascii="Times New Roman" w:cs="David" w:eastAsia="Times New Roman" w:hAnsi="Times New Roman"/>
+          <w:b w:val="false"/>
+          <w:i w:val="false"/>
+          <w:iCs w:val="false"/>
+          <w:sz w:val="24"/>
+          <w:szCs w:val="24"/>
+          <w:rtl/>
+          <w:lang w:val="en-US" w:bidi="he-IL"/>
+        </w:rPr>
+        <w:t xml:space="preserve">אצל תלמידים חלשים הגשר הזה הופך לעבודתה העיקרית של המורה. אמל מתארת שמורת הכיתה משחקת וממשיכה הלאה, ואילו היא, כמורת שילוב, נשארת עם הילד אחרי המשחק עד שהקישור מושלם. סוהא מנסחת את הכלל: "המשחק פותח את הדלת לתלמיד החלש, והמורה חייבת להיכנס איתו אחר כך, בחמש דקות אישיות או בקבוצה קטנה, אחרת הוא נשאר עומד בפתח וכולם חושבים שהוא נכנס".</w:t>
       </w:r>
     </w:p>
     <w:p>
@@ -5662,47 +5661,47 @@
           <w:rtl/>
           <w:lang w:val="en-US" w:bidi="he-IL"/>
         </w:rPr>
-        <w:t xml:space="preserve">שש משתתפות הבחינו שהשיפור הגיע משני השלישים התחתונים של הכיתה ולא מהשליש העליון. רחאב אמרה ש"התלמידים שהיו בראש הכיתה לא שינו הרבה את ציוניהם, כל ההבדל הגיע מהאמצע ומהתחתית, וזה אומר שהמשחקים צמצמו את הפער". סוהא ראתה ברמת בית הספר ש"הכיתות החלשות התקרבו לכיתות החזקות". בקבוצות השילוב השוותה אמל בין שתי קבוצות ברמה דומה, שעם הראשונה עבדה בשיטות המסורתיות של החינוך המיוחד ועם השנייה הוסיפה משחקי תנועה: במבחן סוף השנה עברו שניים מתוך חמישה בראשונה וארבעה מתוך חמישה בשנייה.</w:t>
-      </w:r>
-    </w:p>
-    <w:p>
-      <w:pPr>
-        <w:bidi/>
-        <w:spacing w:after="120" w:before="0" w:line="480"/>
-        <w:jc w:val="both"/>
-      </w:pPr>
-      <w:r>
-        <w:rPr>
-          <w:rFonts w:ascii="Times New Roman" w:cs="David" w:eastAsia="Times New Roman" w:hAnsi="Times New Roman"/>
-          <w:b w:val="false"/>
-          <w:i w:val="false"/>
-          <w:iCs w:val="false"/>
-          <w:sz w:val="24"/>
-          <w:szCs w:val="24"/>
-          <w:rtl/>
-          <w:lang w:val="en-US" w:bidi="he-IL"/>
-        </w:rPr>
-        <w:t xml:space="preserve">המשתתפות תיארו את מה שקורה לתלמיד החלש במשחק בפרטים דומים. בשיעור רגיל הוא "יושב מאחור, לא מרים יד, וכשאני שואלת אותו הוא מסתכל על השולחן, ולפעמים מפריע כדי להסתיר שהוא לא מבין", כדברי מנאל, ובמשחק "לא שואלים 'מי יודע' אלא 'מי קופץ', ולקפוץ כולם יכולים". נג'ווא מוסיפה שהתלמיד החלש במשחק "מבין תוך כדי התנועה ולא לפניה, וזה ההפך משיעור רגיל שדורש הבנה קודם ואז יישום", ושהוא "שומע את החשיבה של החברים החזקים בקול רם". רחאב מתארת גילוי שמתרחש אצל התלמיד החלש בכיתות הגבוהות: "שהרעיון המתמטי לא מעבר ליכולתו, ושמה שהיה מעבר ליכולתו הוא רק הסמל".</w:t>
-      </w:r>
-    </w:p>
-    <w:p>
-      <w:pPr>
-        <w:bidi/>
-        <w:spacing w:after="120" w:before="0" w:line="480"/>
-        <w:jc w:val="both"/>
-      </w:pPr>
-      <w:r>
-        <w:rPr>
-          <w:rFonts w:ascii="Times New Roman" w:cs="David" w:eastAsia="Times New Roman" w:hAnsi="Times New Roman"/>
-          <w:b w:val="false"/>
-          <w:i w:val="false"/>
-          <w:iCs w:val="false"/>
-          <w:sz w:val="24"/>
-          <w:szCs w:val="24"/>
-          <w:rtl/>
-          <w:lang w:val="en-US" w:bidi="he-IL"/>
-        </w:rPr>
-        <w:t xml:space="preserve">עם זאת, המשתתפות הבחינו בין שני סוגים של תלמידים חלשים. רחאב אומרת שסלמא לימדה אותה "להבחין בין שני סוגים של תלמידים חלשים: מי שצריך עוד תרגול ומי שצריך דרך אחרת, ושמשחקי תנועה מועילים לסוג השני הרבה יותר". ופאא אומרת על למא שהאתגרים בתנועה מועילים ל"תלמיד שמתאמץ בלי להבין" יותר מאשר ל"תלמיד שלא מתאמץ". ע'דיר מתארת את טארק, שנענש על הליכה בכיתה, כ"תלמיד שצריך תנועה כדי לחשוב, והעונש על ההליכה מנע ממנו לחשוב".</w:t>
+        <w:t xml:space="preserve">שש משתתפות הבחינו שהשיפור הגיע משני השלישים התחתונים של הכיתה ולא מהשליש העליון. רחאב אמרה ש"התלמידים שהיו בראש הכיתה לא שינו הרבה את ציוניהם, כל ההבדל הגיע מהאמצע ומהתחתית, וזה אומר שהמשחקים צמצמו את הפער", וסוהא ראתה תופעה דומה ברמת בית הספר, כשהכיתות החלשות התקרבו לכיתות החזקות. בקבוצות השילוב השוותה אמל בין שתי קבוצות ברמה דומה, שעם הראשונה עבדה בשיטות המסורתיות של החינוך המיוחד ועם השנייה הוסיפה משחקי תנועה: במבחן סוף השנה עברו שניים מתוך חמישה בראשונה וארבעה מתוך חמישה בשנייה.</w:t>
+      </w:r>
+    </w:p>
+    <w:p>
+      <w:pPr>
+        <w:bidi/>
+        <w:spacing w:after="120" w:before="0" w:line="480"/>
+        <w:jc w:val="both"/>
+      </w:pPr>
+      <w:r>
+        <w:rPr>
+          <w:rFonts w:ascii="Times New Roman" w:cs="David" w:eastAsia="Times New Roman" w:hAnsi="Times New Roman"/>
+          <w:b w:val="false"/>
+          <w:i w:val="false"/>
+          <w:iCs w:val="false"/>
+          <w:sz w:val="24"/>
+          <w:szCs w:val="24"/>
+          <w:rtl/>
+          <w:lang w:val="en-US" w:bidi="he-IL"/>
+        </w:rPr>
+        <w:t xml:space="preserve">המשתתפות תיארו את מה שקורה לתלמיד החלש במשחק בפרטים דומים. בשיעור רגיל הוא יושב מאחור, אינו מרים יד, מסתכל על השולחן כשהוא נשאל ולעיתים מפריע כדי להסתיר שאינו מבין, ואילו במשחק, כדברי מנאל, "לא שואלים 'מי יודע' אלא 'מי קופץ', ולקפוץ כולם יכולים". נג'ווא מוסיפה שהתלמיד החלש מבין במשחק תוך כדי התנועה ולא לפניה, ושהוא שומע את החשיבה של החברים החזקים בקול רם, ורחאב מתארת שהתלמיד החלש בכיתות הגבוהות מגלה במשחק שהרעיון המתמטי אינו מעבר ליכולתו, ושמה שהיה מעבר ליכולתו הוא הסמל בלבד.</w:t>
+      </w:r>
+    </w:p>
+    <w:p>
+      <w:pPr>
+        <w:bidi/>
+        <w:spacing w:after="120" w:before="0" w:line="480"/>
+        <w:jc w:val="both"/>
+      </w:pPr>
+      <w:r>
+        <w:rPr>
+          <w:rFonts w:ascii="Times New Roman" w:cs="David" w:eastAsia="Times New Roman" w:hAnsi="Times New Roman"/>
+          <w:b w:val="false"/>
+          <w:i w:val="false"/>
+          <w:iCs w:val="false"/>
+          <w:sz w:val="24"/>
+          <w:szCs w:val="24"/>
+          <w:rtl/>
+          <w:lang w:val="en-US" w:bidi="he-IL"/>
+        </w:rPr>
+        <w:t xml:space="preserve">עם זאת, המשתתפות הבחינו בין שני סוגים של תלמידים חלשים. רחאב אומרת שסלמא לימדה אותה "להבחין בין שני סוגים של תלמידים חלשים: מי שצריך עוד תרגול ומי שצריך דרך אחרת, ושמשחקי תנועה מועילים לסוג השני הרבה יותר". ופאא הבחינה הבחנה דומה אצל למא, בין תלמיד שמתאמץ בלי להבין לתלמיד שאינו מתאמץ, וע'דיר תיארה את טארק, שנענש על הליכה בכיתה, כתלמיד שזקוק לתנועה כדי לחשוב.</w:t>
       </w:r>
     </w:p>
     <w:p>
@@ -5763,7 +5762,7 @@
           <w:rtl/>
           <w:lang w:val="en-US" w:bidi="he-IL"/>
         </w:rPr>
-        <w:t xml:space="preserve">לצד ראיה זו הביאו המשתתפות עדויות של התלמידים עצמם. סלמא אמרה לרחאב: "קודם שיננתי ולא הבנתי, ועכשיו אני רואה את הפתרון בראש כאילו אני הולכת עליו". למא אמרה לופאא: "קודם שיננתי ולא ראיתי, ועכשיו אני רואה את המספר על הציר". עומר אמר למייסון: "בחצר אני מבין ובכיתה לא". שלוש העדויות מתארות את אותו דבר במילים שונות: החזקת תמונה של המושג.</w:t>
+        <w:t xml:space="preserve">לצד ראיה זו הביאו המשתתפות עדויות של התלמידים עצמם. שלוש מורות ציטטו תלמידים שאמרו כמעט אותו דבר, שקודם שיננו ולא ראו ועכשיו הם רואים את המספר או את הפתרון. סלמא, תלמידתה של רחאב, אמרה: "קודם שיננתי ולא הבנתי, ועכשיו אני רואה את הפתרון בראש כאילו אני הולכת עליו".</w:t>
       </w:r>
     </w:p>
     <w:p>
@@ -5804,7 +5803,7 @@
           <w:rtl/>
           <w:lang w:val="en-US" w:bidi="he-IL"/>
         </w:rPr>
-        <w:t xml:space="preserve">שבע מהמשתתפות משוות באופן שיטתי בין מה שהתלמידים זוכרים מהמושגים שנלמדו בתנועה לבין מה שהם זוכרים מהמושגים שהוסברו, במבחן קצר בתחילת כל חודש או כל מחצית. רחאב העריכה את השיעור בשלושה רבעים מהכיתה לעומת פחות ממחצית לאחר שלושה חודשים, סוהא בשבעים אחוז לעומת ארבעים אחוז לאחר הקיץ, ונג'ווא בשמונים אחוז לעומת חמישים אחוז לאחר חודשיים. חשוב מהשיעור, בעיניהן, הוא אופן הזכירה: התלמיד שולף תחילה את המשחק ובונה ממנו את הכלל. מנאל אומרת שהתלמידים "זוכרים דרך המשחק עצמו: אני שואלת על חיסור והם אומרים 'הרכבת'", וסוהא אומרת שהתלמידים כותבים במבחן האבחון "על ההיקף הולכים ועל השטח יושבים". היא מסבירה זאת בכך ש"התנועה נותנת לתלמיד התנסות שהוא יכול לשחזר בראשו", ומייסון מסבירה זאת בכך ש"מה שהתלמיד למד בגופו נשמר כאירוע שחווה, ואירועים נשכחים פחות ממידע".</w:t>
+        <w:t xml:space="preserve">שבע מהמשתתפות משוות באופן שיטתי בין מה שהתלמידים זוכרים מהמושגים שנלמדו בתנועה לבין מה שהם זוכרים מהמושגים שהוסברו, במבחן קצר בתחילת כל חודש או כל מחצית. רחאב העריכה את השיעור בשלושה רבעים מהכיתה לעומת פחות ממחצית לאחר שלושה חודשים, סוהא בשבעים אחוז לעומת ארבעים אחוז לאחר הקיץ, ונג'ווא בשמונים אחוז לעומת חמישים אחוז לאחר חודשיים. חשוב מהשיעור, בעיניהן, הוא אופן הזכירה: התלמיד שולף תחילה את המשחק ובונה ממנו את הכלל. מנאל אומרת שהתלמידים "זוכרים דרך המשחק עצמו: אני שואלת על חיסור והם אומרים 'הרכבת'", וסוהא מתארת שהתלמידים כותבים במבחן האבחון את המשפט שנוצר במשחק על ההיקף והשטח. סוהא מסבירה זאת בכך שהתנועה נותנת לתלמיד התנסות שהוא יכול לשחזר בראשו, ומייסון מנסחת הסבר דומה: "מה שהתלמיד למד בגופו נשמר כאירוע שחווה, ואירועים נשכחים פחות ממידע".</w:t>
       </w:r>
     </w:p>
     <w:p>
@@ -5885,7 +5884,7 @@
           <w:rtl/>
           <w:lang w:val="en-US" w:bidi="he-IL"/>
         </w:rPr>
-        <w:t xml:space="preserve">התוצאה המשותפת שתיארו המורות היא שדף העבודה בשיעור הבא היה גרוע יותר מלפני המשחק. רחאב מסכמת: "כישלון במשחק מזיק יותר מהסבר משעמם, כי הוא מבלבל את המושג, וכי התלמידים מאבדים אמון במשחק הבא". מייסון מוסיפה שהתלמידים אמרו במשחק הבא "זה יהיה בלגן כמו בפעם הקודמת?". מהניסיונות האלה יצאו המשתתפות עם פרקטיקה אחת שחזרה אצל חמש מהן ללא תיאום: ניסוי כל משחק חדש תחילה עם קבוצה קטנה של שישה תלמידים בזמן ההפסקה לפני יישומו על הכיתה.</w:t>
+        <w:t xml:space="preserve">התוצאה המשותפת שתיארו המורות היא שדף העבודה בשיעור הבא היה גרוע יותר מלפני המשחק. רחאב מסכמת: "כישלון במשחק מזיק יותר מהסבר משעמם, כי הוא מבלבל את המושג, וכי התלמידים מאבדים אמון במשחק הבא". מייסון מוסיפה שתלמידיה שאלו לפני המשחק הבא אם יהיה בלגן כמו בפעם הקודמת. מהניסיונות האלה יצאו המשתתפות עם פרקטיקה אחת שחזרה אצל חמש מהן ללא תיאום: ניסוי כל משחק חדש תחילה עם קבוצה קטנה של שישה תלמידים בזמן ההפסקה לפני יישומו על הכיתה.</w:t>
       </w:r>
     </w:p>
     <w:p>
@@ -5967,7 +5966,7 @@
           <w:rtl/>
           <w:lang w:val="en-US" w:bidi="he-IL"/>
         </w:rPr>
-        <w:t xml:space="preserve">התופעה שמשכה את תשומת לבן של ארבע מורות היא חזרה ספונטנית על המושג לפני המשחק. ע'דיר מתארת: "התלמידים מתחילים לחזור על הלוח בקול לפני המשחק, כי הם רוצים לקפוץ בלי טעות, כלומר הם חוזרים על השיעור מעצמם, וזה לא קורה אפילו לפני מבחן". מנאל מספרת שתלמיד אמר לחברו "תזכור, בחיסור חוזרים אחורה" כי רצה לנצח. בכיתות הגבוהות האווירה שונה. היא מתחילה במה שסוהא מכנה "מבחן": "'זה משחק לקטנים?' אומרים תלמיד או תלמידה בנימה של אתגר", והיא משתנה רק כשהמשחק מוצג כבעיה או כתחרות. שלוש מורות של הכיתות הגבוהות מתארות היפוך תפקידים: התלמידים הפעלתנים שמוצאים משיעור רגיל הופכים למנהיגי המשחק, "כי המשחק נותן ערך לתנועה, למהירות ולארגון, ואלה דברים שהם טובים בהם", כדברי רחאב.</w:t>
+        <w:t xml:space="preserve">התופעה שמשכה את תשומת לבן של ארבע מורות היא חזרה ספונטנית על המושג לפני המשחק. ע'דיר מתארת: "התלמידים מתחילים לחזור על הלוח בקול לפני המשחק, כי הם רוצים לקפוץ בלי טעות, כלומר הם חוזרים על השיעור מעצמם, וזה לא קורה אפילו לפני מבחן". מנאל מספרת על תלמיד שהזכיר לחברו לפני המשחק שבחיסור חוזרים אחורה, משום שרצה לנצח. בכיתות הגבוהות האווירה שונה. היא מתחילה במה שסוהא מכנה "מבחן": "'זה משחק לקטנים?' אומרים תלמיד או תלמידה בנימה של אתגר", והיא משתנה רק כשהמשחק מוצג כבעיה או כתחרות. שלוש מורות של הכיתות הגבוהות מתארות היפוך תפקידים: התלמידים הפעלתנים שמוצאים משיעור רגיל הופכים למנהיגי המשחק, "כי המשחק נותן ערך לתנועה, למהירות ולארגון, ואלה דברים שהם טובים בהם", כדברי רחאב.</w:t>
       </w:r>
     </w:p>
     <w:p>
@@ -6028,7 +6027,7 @@
           <w:rtl/>
           <w:lang w:val="en-US" w:bidi="he-IL"/>
         </w:rPr>
-        <w:t xml:space="preserve">אמל מתארת את חמזה, שקולו לא נשמע חודשיים, בכך ש"המשחק אפשר לו להשתתף בלי לדבר, עד שהדיבור נעשה קל", ומנאל מתארת את ג'נא בכך ש"ההשתתפות התחילה בגוף לפני הדיבור". אצל התלמידים שמסווגים "מפריעים" בכיתות הגבוהות התחיל המסלול מתפקיד שיש בו סמכות ושאינו נראה מתמטי: רחאב הפקידה את יזן על מדידת הציר בסרט מידה, ופאא הפקידה את נידאל על סימון הציר העשרוני, ונג'ווא הפכה את מאלכ ל"שומר המעגל". נג'ווא מסבירה: "השיעור הרגיל נתן לו שתי אפשרויות: לענות או להיענש, והמשחק נתן לו אפשרות שלישית: להיות מועיל בלי תשובה, ומשם הוא בנה את ביטחונו".</w:t>
+        <w:t xml:space="preserve">אמל מתארת מסלול דומה אצל חמזה, שקולו לא נשמע חודשיים והמשחק אפשר לו להשתתף בלי לדבר עד שהדיבור נעשה קל, ומנאל מתארת אותו אצל ג'נא, שהשתתפותה התחילה בגוף לפני הדיבור. אצל התלמידים שמסווגים "מפריעים" בכיתות הגבוהות התחיל המסלול מתפקיד שיש בו סמכות ושאינו נראה מתמטי: רחאב הפקידה את יזן על מדידת הציר בסרט מידה, ופאא הפקידה את נידאל על סימון הציר העשרוני, ונג'ווא הפכה את מאלכ ל"שומר המעגל". נג'ווא מסבירה: "השיעור הרגיל נתן לו שתי אפשרויות: לענות או להיענש, והמשחק נתן לו אפשרות שלישית: להיות מועיל בלי תשובה, ומשם הוא בנה את ביטחונו".</w:t>
       </w:r>
     </w:p>
     <w:p>
@@ -6129,7 +6128,7 @@
           <w:rtl/>
           <w:lang w:val="en-US" w:bidi="he-IL"/>
         </w:rPr>
-        <w:t xml:space="preserve">המשתתפות האחרות הביאו שאלות מאותו סוג: "מה אם כולם יירדו מהאוטובוס?" אצל אמל, "מה אם ייכנסו מאה תלמידים למעגל היחידות?" אצל מייסון, ו"למה 0.09 קטן מ-0.1?" אצל ופאא. את ההתמדה תיארו המורות בכך שתלמיד שטועה בשיעור רגיל "מוחק, עוצר ומחכה", ובמשחק הוא מנסה שוב בעצמו. מנאל ראתה תלמידים "שחוזרים על הקפיצה ארבע פעמים בלי שאיש ביקש", ורחאב ראתה קבוצה "שמודדת את הציר ארבע פעמים עד שהיא בטוחה".</w:t>
+        <w:t xml:space="preserve">המשתתפות האחרות הביאו שאלות מאותו סוג: מה יקרה אם כולם יירדו מהאוטובוס אצל אמל, מה יקרה אם ייכנסו מאה תלמידים למעגל היחידות אצל מייסון, ומדוע 0.09 קטן מ-0.1 אצל ופאא. את ההתמדה תיארו המורות בכך שתלמיד שטועה בשיעור רגיל מוחק, עוצר ומחכה, ואילו במשחק הוא מנסה שוב בעצמו. מנאל ראתה תלמידים "שחוזרים על הקפיצה ארבע פעמים בלי שאיש ביקש", ורחאב תיארה קבוצה שמדדה את הציר ארבע פעמים עד שהייתה בטוחה.</w:t>
       </w:r>
     </w:p>
     <w:p>
@@ -6170,27 +6169,27 @@
           <w:rtl/>
           <w:lang w:val="en-US" w:bidi="he-IL"/>
         </w:rPr>
-        <w:t xml:space="preserve">המשתתפות לא הציגו את המוטיבציה כרווח מובטח. שש מהן ציינו שהמוטיבציה במשחק עלולה להיות לניצחון, לתנועה או ליציאה לחצר ולא למתמטיקה. מייסון אומרת ש"התלמידים מקבלים כל דבר בחצר", ורחאב אומרת ש"קורה שקבוצה מרמה או רבה על נקודות". שלוש מורות הבחינו שריבוי משחקים מפחית את השפעתם, והאיזון שהמליצו עליו סוהא ונג'ווא הוא "משחק אחד בכל שלושה שיעורים". כולן הבחינו שהשפעת המשחק נמשכת לשיעור הבא ואז דועכת, ורחאב תיארה שהיא משתמשת במשחק "כדלק שמוסיפים כל שבוע, ולא כמנוע קבוע". מייסון קשרה את המוטיבציה למדד שלא הופיע אצל אחרות: יומן הנוכחות, שכן "ההיעדרות פוחתת בימים שהם יודעים שיש בהם משחק".</w:t>
-      </w:r>
-    </w:p>
-    <w:p>
-      <w:pPr>
-        <w:bidi/>
-        <w:spacing w:after="120" w:before="0" w:line="480"/>
-        <w:jc w:val="both"/>
-      </w:pPr>
-      <w:r>
-        <w:rPr>
-          <w:rFonts w:ascii="Times New Roman" w:cs="David" w:eastAsia="Times New Roman" w:hAnsi="Times New Roman"/>
-          <w:b w:val="false"/>
-          <w:i w:val="false"/>
-          <w:iCs w:val="false"/>
-          <w:sz w:val="24"/>
-          <w:szCs w:val="24"/>
-          <w:rtl/>
-          <w:lang w:val="en-US" w:bidi="he-IL"/>
-        </w:rPr>
-        <w:t xml:space="preserve">בהתמודדות עם תלמידים שמסרבים, מתביישים או מגזימים, הפרקטיקות של שמונה המשתתפות היו דומות במידה רבה. עם המסרבים: תפקיד קבוע ללא תנועה מול כולם וללא תשובה, והמתנה ללא לחץ. ארבע מורות ציינו, כל אחת לחוד, שניסו פעם לומר "כולם מחכים לך", והילד בכה ופרש לחודש. עם המתביישים, לרוב בנות: זוג עם חברה, משחקים קבוצתיים שאינם מבליטים אף אחד, התחלה בתוך הכיתה ולא במסדרון, בכיתה ו' קבוצות בנות נפרדות, והימנעות ממחיאות כפיים מוגזמות, כי "מחיאות כפיים הן חשיפה, והילדה הביישנית רוצה להשתתף בלי חשיפה", כדברי אמל. עם המגזימים, לרוב בנים פעלתנים: כללים מעטים כתובים לפני המשחק, סימן עצירה קבוע, תפקיד עם אחריות שסופג אנרגיה, והסכמה אישית איתם לפני השיעור. ומה שלא עובד, לפי כל המשתתפות: צעקות ש"מגבירות את הרעש ולא מפחיתות אותו", הוצאה מהמשחק, ומניעת המשחק הבא, כי זה "הופך את המשחק לעונש".</w:t>
+        <w:t xml:space="preserve">המשתתפות לא הציגו את המוטיבציה כרווח מובטח. שש מהן ציינו שהמוטיבציה במשחק עלולה להיות לניצחון, לתנועה או ליציאה לחצר ולא למתמטיקה. מייסון אומרת שהתלמידים מקבלים כל דבר בחצר, ורחאב מוסיפה ש"קורה שקבוצה מרמה או רבה על נקודות". שלוש מורות הבחינו שריבוי משחקים מפחית את השפעתם, והאיזון שהמליצו עליו סוהא ונג'ווא הוא "משחק אחד בכל שלושה שיעורים". כולן הבחינו שהשפעת המשחק נמשכת לשיעור הבא ואז דועכת, ורחאב תיארה שהיא משתמשת במשחק "כדלק שמוסיפים כל שבוע, ולא כמנוע קבוע". מייסון קשרה את המוטיבציה למדד שלא הופיע אצל אחרות: יומן הנוכחות, שכן "ההיעדרות פוחתת בימים שהם יודעים שיש בהם משחק".</w:t>
+      </w:r>
+    </w:p>
+    <w:p>
+      <w:pPr>
+        <w:bidi/>
+        <w:spacing w:after="120" w:before="0" w:line="480"/>
+        <w:jc w:val="both"/>
+      </w:pPr>
+      <w:r>
+        <w:rPr>
+          <w:rFonts w:ascii="Times New Roman" w:cs="David" w:eastAsia="Times New Roman" w:hAnsi="Times New Roman"/>
+          <w:b w:val="false"/>
+          <w:i w:val="false"/>
+          <w:iCs w:val="false"/>
+          <w:sz w:val="24"/>
+          <w:szCs w:val="24"/>
+          <w:rtl/>
+          <w:lang w:val="en-US" w:bidi="he-IL"/>
+        </w:rPr>
+        <w:t xml:space="preserve">בהתמודדות עם תלמידים שמסרבים, מתביישים או מגזימים, הפרקטיקות של שמונה המשתתפות היו דומות במידה רבה. עם המסרבים: תפקיד קבוע ללא תנועה מול כולם וללא תשובה, והמתנה ללא לחץ. ארבע מורות ציינו, כל אחת לחוד, שניסו פעם לומר "כולם מחכים לך", והילד בכה ופרש לחודש. עם המתביישים, לרוב בנות: זוג עם חברה, משחקים קבוצתיים שאינם מבליטים אף אחד, התחלה בתוך הכיתה ולא במסדרון, בכיתה ו' קבוצות בנות נפרדות, והימנעות ממחיאות כפיים מוגזמות, כי "מחיאות כפיים הן חשיפה, והילדה הביישנית רוצה להשתתף בלי חשיפה", כדברי אמל. עם המגזימים, לרוב בנים פעלתנים: כללים מעטים כתובים לפני המשחק, סימן עצירה קבוע, תפקיד עם אחריות שסופג אנרגיה, והסכמה אישית איתם לפני השיעור. ומה שלא עובד, לפי כל המשתתפות: צעקות שמגבירות את הרעש ולא מפחיתות אותו, הוצאה מהמשחק, ומניעת המשחק הבא, כי זה "הופך את המשחק לעונש".</w:t>
       </w:r>
     </w:p>
     <w:p>
@@ -6252,27 +6251,27 @@
           <w:rtl/>
           <w:lang w:val="en-US" w:bidi="he-IL"/>
         </w:rPr>
-        <w:t xml:space="preserve">כשנשאלו המשתתפות בשאלת הסיום מה לא נשאל, ענו שלוש מהן, אלה שרואות מורות אחרות בעבודתן, אותה תשובה: המורה. סוהא אומרת: "אני רואה תשע מורות משתמשות באותו משחק, חלקן מצליחות וחלקן נכשלות, וההבדל אינו במשחק אלא במורה". נג'ווא אומרת ש"אותו משחק בידי מורה בטוחה מלמד, ובידי מורה מתוחה מבזבז את השיעור". הגורם שהן מזהות אינו הוותק אלא הרוגע והביטחון: "מורה מתוחה יוצרת תלמידים שמגזימים, ומורה שפוחדת מבלגן יוצרת תלמידים שמסרבים, כי הם מרגישים שהיא לא מאמינה במשחק", כדברי סוהא. נג'ווא מוסיפה שהיא יכולה לנבא את תוצאת המשחק מהדקה הראשונה שאחרי ההכרזה: אם הדקה משמשת להסבר המטרה והכלל האחד, המשחק מצליח, ואם היא מתבזבזת בצעקות "תירגעו", הוא נכשל.</w:t>
-      </w:r>
-    </w:p>
-    <w:p>
-      <w:pPr>
-        <w:bidi/>
-        <w:spacing w:after="120" w:before="0" w:line="480"/>
-        <w:jc w:val="both"/>
-      </w:pPr>
-      <w:r>
-        <w:rPr>
-          <w:rFonts w:ascii="Times New Roman" w:cs="David" w:eastAsia="Times New Roman" w:hAnsi="Times New Roman"/>
-          <w:b w:val="false"/>
-          <w:i w:val="false"/>
-          <w:iCs w:val="false"/>
-          <w:sz w:val="24"/>
-          <w:szCs w:val="24"/>
-          <w:rtl/>
-          <w:lang w:val="en-US" w:bidi="he-IL"/>
-        </w:rPr>
-        <w:t xml:space="preserve">המורות הפחות ותיקות מאשרות את התמונה מהצד השני. ופאא מתארת את שנתה הראשונה, כשתלמיד אמר "המורה, אנחנו לא בגן", היא איבדה שליטה בכיתה והפסיקה למחצית שלמה, ואומרת: "אילו הייתה לי חונכת בשנה הראשונה, לא הייתי צריכה את כל הטעויות האלה". ע'דיר מתארת שכמעט זנחה את הרעיון בשנתה הראשונה לולא עמיתה שלימדה אותה "שהמשחק צריך מבנה". נג'ווא מציינת ש"מורה שנכשלה במשחקה הראשון עלולה לזנוח את השיטה כולה", ולכן החניכה במשחק הראשון חשובה בעיניה מכל השתלמות.</w:t>
+        <w:t xml:space="preserve">כשנשאלו המשתתפות בשאלת הסיום מה לא נשאל, ענו שלוש מהן, אלה שרואות מורות אחרות בעבודתן, אותה תשובה: המורה. סוהא אומרת: "אני רואה תשע מורות משתמשות באותו משחק, חלקן מצליחות וחלקן נכשלות, וההבדל אינו במשחק אלא במורה", ונג'ווא מתארת מניסיונה כחונכת שאותו משחק בידי מורה בטוחה מלמד ובידי מורה מתוחה מבזבז את השיעור. הגורם שהן מזהות אינו הוותק אלא הרוגע והביטחון: מורה מתוחה יוצרת לדבריהן תלמידים שמגזימים, ומורה שפוחדת מאי-סדר יוצרת תלמידים שמסרבים, משום שהם מרגישים שאינה מאמינה במשחק. נג'ווא מוסיפה שהיא יכולה לנבא את תוצאת המשחק מהדקה הראשונה שאחרי ההכרזה: אם הדקה משמשת להסבר המטרה והכלל האחד, המשחק מצליח, ואם היא מתבזבזת בצעקות "תירגעו", הוא נכשל.</w:t>
+      </w:r>
+    </w:p>
+    <w:p>
+      <w:pPr>
+        <w:bidi/>
+        <w:spacing w:after="120" w:before="0" w:line="480"/>
+        <w:jc w:val="both"/>
+      </w:pPr>
+      <w:r>
+        <w:rPr>
+          <w:rFonts w:ascii="Times New Roman" w:cs="David" w:eastAsia="Times New Roman" w:hAnsi="Times New Roman"/>
+          <w:b w:val="false"/>
+          <w:i w:val="false"/>
+          <w:iCs w:val="false"/>
+          <w:sz w:val="24"/>
+          <w:szCs w:val="24"/>
+          <w:rtl/>
+          <w:lang w:val="en-US" w:bidi="he-IL"/>
+        </w:rPr>
+        <w:t xml:space="preserve">המורות הפחות ותיקות מאשרות את התמונה מהצד השני. ופאא מתארת את שנתה הראשונה, כשתלמיד אמר "המורה, אנחנו לא בגן", היא איבדה שליטה בכיתה והפסיקה למחצית שלמה, ואומרת: "אילו הייתה לי חונכת בשנה הראשונה, לא הייתי צריכה את כל הטעויות האלה". ע'דיר מתארת שכמעט זנחה את הרעיון בשנתה הראשונה לולא עמיתה שלימדה אותה שהמשחק צריך מבנה, ונג'ווא מציינת שמורה שנכשלה במשחקה הראשון עלולה לזנוח את השיטה כולה, ולכן החניכה במשחק הראשון חשובה בעיניה מכל השתלמות.</w:t>
       </w:r>
     </w:p>
     <w:p>
@@ -6374,7 +6373,7 @@
           <w:rtl/>
           <w:lang w:val="en-US" w:bidi="he-IL"/>
         </w:rPr>
-        <w:t xml:space="preserve">מייסון, מבית ספרה הכפרי, הוסיפה ממד שלא הופיע אצל אחרות. הגוף אצלה הוא "אמצעי ההוראה היחיד שיש לי בלי גבולות", ומשחקי תנועה בבתי ספר עניים "חשובים יותר מאשר בבתי ספר עשירים, כי הם אמצעי ההוראה היחיד שהוא חינמי וזמין תמיד". היא מתחשבת במה שמי שעובד בבית ספר עם אולם אינו חושב עליו: "הבגדים והנעליים, כי חלק מהתלמידים לא יכולים לזחול על העפר או לקפוץ בנעליים קרועות". היא מתחשבת גם בכך שחלק מהאבות אינם רוצים שבנותיהם ינועו בחצר מול הבנים, ולכן היא משחקת עם הבנות במסדרון הפנימי.</w:t>
+        <w:t xml:space="preserve">מייסון, מבית ספרה הכפרי, הוסיפה ממד שלא הופיע אצל אחרות. לדבריה, משחקי תנועה בבתי ספר עניים "חשובים יותר מאשר בבתי ספר עשירים, כי הם אמצעי ההוראה היחיד שהוא חינמי וזמין תמיד". היא מתחשבת במה שמי שעובד בבית ספר עם אולם אינו חושב עליו: "הבגדים והנעליים, כי חלק מהתלמידים לא יכולים לזחול על העפר או לקפוץ בנעליים קרועות". היא מתחשבת גם בכך שחלק מהאבות אינם רוצים שבנותיהם ינועו בחצר מול הבנים, ולכן היא משחקת עם הבנות במסדרון הפנימי.</w:t>
       </w:r>
     </w:p>
     <w:p>
@@ -6435,7 +6434,7 @@
           <w:rtl/>
           <w:lang w:val="en-US" w:bidi="he-IL"/>
         </w:rPr>
-        <w:t xml:space="preserve">בשאלת הסיום הוסיפו המשתתפות שתי השפעות שהמחקר לא שאל עליהן. הראשונה, השפעת המשחקים על היחסים בין המורה לתלמידיה: ע'דיר אומרת ש"התלמידים ששיחקו איתי סומכים עליי יותר", וופאא אומרת שהפכה מ"המורה שמוציאה אותנו" ל"המורה שיש לה אתגרים". השנייה, השפעתם על המורה עצמה: "אני יוצאת משיעור משחק עייפה בגוף ורגועה בנפש, ומשיעור רגיל ההפך", כדברי מנאל. אמל הצביעה על השפעה חברתית ייחודית לילדי השילוב: במשחק "הוא ילד שנע כמו כולם, והוא יכול להיות הנהג, והוא יכול לנצח, והחברים רואים אותו בעין אחרת".</w:t>
+        <w:t xml:space="preserve">בשאלת הסיום הוסיפו המשתתפות שתי השפעות שהמחקר לא שאל עליהן. הראשונה, השפעת המשחקים על היחסים בין המורה לתלמידיה: ע'דיר אומרת ש"התלמידים ששיחקו איתי סומכים עליי יותר", וופאא מתארת שינוי דומה בכינוי שהתלמידים נותנים לה. השנייה, השפעתם על המורה עצמה: "אני יוצאת משיעור משחק עייפה בגוף ורגועה בנפש, ומשיעור רגיל ההפך", כדברי מנאל. אמל הצביעה על השפעה חברתית ייחודית לילדי השילוב: במשחק "הוא ילד שנע כמו כולם, והוא יכול להיות הנהג, והוא יכול לנצח, והחברים רואים אותו בעין אחרת".</w:t>
       </w:r>
     </w:p>
     <w:p>

</xml_diff>

<commit_message>
Restore a 42-word quote as an indented block per the 40-word rule
Co-Authored-By: Claude Fable 5.1 <noreply@anthropic.com>
Claude-Session: https://claude.ai/code/session_01KzGBsiV6nnPrrZTki3wcT1
</commit_message>
<xml_diff>
--- a/papers/kinesthetic-games-math-primary/kinesthetic-games-seminar-he.docx
+++ b/papers/kinesthetic-games-math-primary/kinesthetic-games-seminar-he.docx
@@ -6007,7 +6007,28 @@
           <w:rtl/>
           <w:lang w:val="en-US" w:bidi="he-IL"/>
         </w:rPr>
-        <w:t xml:space="preserve">כשנשאלו המשתתפות על תלמיד שלא השתתף, כל אחת סיפרה על מקרה, ושמונת המקרים עוקבים אחר מסלול אחד כמעט: השתתפות בגוף בלי דיבור, אחר כך דיבור עם הקבוצה הקטנה, אחר כך דיבור מול הכיתה בתוך המשחק, ואחר כך דיבור מול הכיתה מחוץ למשחק. ע'דיר מתארת את מסלולה של נדא: "מה שראיתי בדיוק הוא שההשתתפות של נדא הייתה הדרגתית: תחילה השתתפות בגוף בלי דיבור, אחר כך דיבור עם הקבוצה הקטנה, אחר כך דיבור מול הכיתה בתוך המשחק, ואחר כך דיבור מול הכיתה מחוץ למשחק. כל שלב היה אפשרי כי השלב שלפניו הצליח".</w:t>
+        <w:t xml:space="preserve">כשנשאלו המשתתפות על תלמיד שלא השתתף, כל אחת סיפרה על מקרה, ושמונת המקרים עוקבים אחר מסלול אחד כמעט: השתתפות בגוף בלי דיבור, אחר כך דיבור עם הקבוצה הקטנה, אחר כך דיבור מול הכיתה בתוך המשחק, ואחר כך דיבור מול הכיתה מחוץ למשחק. ע'דיר מתארת את מסלולה של נדא:</w:t>
+      </w:r>
+    </w:p>
+    <w:p>
+      <w:pPr>
+        <w:bidi/>
+        <w:spacing w:after="160" w:before="0" w:line="480"/>
+        <w:ind w:left="720" w:right="720"/>
+        <w:jc w:val="both"/>
+      </w:pPr>
+      <w:r>
+        <w:rPr>
+          <w:rFonts w:ascii="Times New Roman" w:cs="David" w:eastAsia="Times New Roman" w:hAnsi="Times New Roman"/>
+          <w:b w:val="false"/>
+          <w:i w:val="false"/>
+          <w:iCs w:val="false"/>
+          <w:sz w:val="24"/>
+          <w:szCs w:val="24"/>
+          <w:rtl/>
+          <w:lang w:val="en-US" w:bidi="he-IL"/>
+        </w:rPr>
+        <w:t xml:space="preserve">מה שראיתי בדיוק הוא שההשתתפות של נדא הייתה הדרגתית: תחילה השתתפות בגוף בלי דיבור, אחר כך דיבור עם הקבוצה הקטנה, אחר כך דיבור מול הכיתה בתוך המשחק, ואחר כך דיבור מול הכיתה מחוץ למשחק. כל שלב היה אפשרי כי השלב שלפניו הצליח.</w:t>
       </w:r>
     </w:p>
     <w:p>

</xml_diff>

<commit_message>
Add twelve recent Hebrew peer-reviewed sources to the Hebrew seminar
Weave Hebrew open-access articles (2021-2026) into the literature review,
a new section on the teacher as mediating factor, and the discussion;
add the two sources supplied by the student; extend the reference list.

Co-Authored-By: Claude Fable 5.1 <noreply@anthropic.com>
Claude-Session: https://claude.ai/code/session_01KzGBsiV6nnPrrZTki3wcT1
</commit_message>
<xml_diff>
--- a/papers/kinesthetic-games-math-primary/kinesthetic-games-seminar-he.docx
+++ b/papers/kinesthetic-games-math-primary/kinesthetic-games-seminar-he.docx
@@ -821,6 +821,26 @@
           <w:rtl/>
           <w:lang w:val="en-US" w:bidi="he-IL"/>
         </w:rPr>
+        <w:t xml:space="preserve">בספרות העברית העדכנית נמצא אותו קו מחשבה בשלושה מוקדים. אלגאוי-הרשלר וחמו (2023) מסכמות לאנשי חינוך לגיל הרך ידע נוירופדגוגי על התפתחות היכולת המתמטית ומנסחות עקרונות הוראה שבמרכזם למידה דרך החושים ודרך משחק אינטואיטיבי, ומציגות משחקים כמו דומינו וקוביות משחק כמודלים כמותיים מובנים שתומכים בקליטת כמויות ובייצוגן בזיכרון. גלילי (2025) מתעדת התערבות במשחק הסוציו-דרמטי בגני ילדים ומראה שתיווך פעיל במשחק מקדם כישורים קוגניטיביים ורגשיים-חברתיים, כלומר שהמשחק אינו רק מסגרת נעימה אלא מנגנון למידה שאפשר לתכנן. גיל וזרעיני (2022) מצאו בראיונות עם גננות מודעות גבוהה לחשיבות התנועה בשגרת הגן לצד ידע מועט על מה שהתנועה תורמת בפועל, פער שיחזור, כפי שיתברר, גם אצל מורות בית הספר היסודי.</w:t>
+      </w:r>
+    </w:p>
+    <w:p>
+      <w:pPr>
+        <w:bidi/>
+        <w:spacing w:after="120" w:before="0" w:line="480"/>
+        <w:jc w:val="both"/>
+      </w:pPr>
+      <w:r>
+        <w:rPr>
+          <w:rFonts w:ascii="Times New Roman" w:cs="David" w:eastAsia="Times New Roman" w:hAnsi="Times New Roman"/>
+          <w:b w:val="false"/>
+          <w:i w:val="false"/>
+          <w:iCs w:val="false"/>
+          <w:sz w:val="24"/>
+          <w:szCs w:val="24"/>
+          <w:rtl/>
+          <w:lang w:val="en-US" w:bidi="he-IL"/>
+        </w:rPr>
         <w:t xml:space="preserve">הספרות מבחינה גם בין שני דפוסים של שילוב תנועה בשיעור. הדפוס הראשון הוא הפסקות תנועה בין פעילויות אקדמיות ללא קשר לתוכן, והשני הוא למידה פעילה גופנית שבה התנועה משולבת בתוכן עצמו (Syväoja et al., 2024; Vazou &amp; Skrade, 2017). משחקי התנועה במובן המכוון כאן שייכים לדפוס השני, שלו התיאוריה צופה השפעה קוגניטיבית ולא רק השפעה על ערנות.</w:t>
       </w:r>
     </w:p>
@@ -902,6 +922,26 @@
           <w:rtl/>
           <w:lang w:val="en-US" w:bidi="he-IL"/>
         </w:rPr>
+        <w:t xml:space="preserve">שני מחקרים ישראליים ממחישים את הצד השני של הפישוט, מה קורה כשהמעבר מן המוחשי אל הסמל אינו מתוכנן. חסידוב ואילני (2025) מצאו שפרחי הוראה לגיל הרך ולכיתות א' וב', ואף גננות ומורות בפועל, משתמשים בסימני היחס גדול, קטן ושווה באופנים מגוונים ולא תמיד נכונים בהיבט הכמותי, המספרי והגרפי, ממצא שמזכיר שגם המושג הבסיסי ביותר זקוק לייצוג כמותי מוחשי לפני הסמל. בן-דוד קוליקנט וברוזה (2014) עיצבו סביבה משחקית ממוחשבת להוראת חיבור וחיסור של שברים עשרוניים לתלמידים מתקשים, ומצאו בסבב הראשון שלחץ הזמן במשחק, תחרות המורה עם המחשב וחוסר אחידות בייצוגים המתמטיים הכשילו את הלמידה. בסבב השני, לאחר שהמשחקים הוחלפו במשחקים שאינם תלויי זמן ונוספו מעבר דידקטי עדין מהמוחשי למופשט ונורמות של דיון, שינו כשמונים אחוזים מהתלמידים חלק מדפוסי ההתנהגות האופייניים לתלמידים מתקשים. מסקנתם, שהמשחק הוא כלי יעיל רק בצירוף הפנמה של נורמות למידה של משמעות, תחזור כמעט מילה במילה בדברי המורות.</w:t>
+      </w:r>
+    </w:p>
+    <w:p>
+      <w:pPr>
+        <w:bidi/>
+        <w:spacing w:after="120" w:before="0" w:line="480"/>
+        <w:jc w:val="both"/>
+      </w:pPr>
+      <w:r>
+        <w:rPr>
+          <w:rFonts w:ascii="Times New Roman" w:cs="David" w:eastAsia="Times New Roman" w:hAnsi="Times New Roman"/>
+          <w:b w:val="false"/>
+          <w:i w:val="false"/>
+          <w:iCs w:val="false"/>
+          <w:sz w:val="24"/>
+          <w:szCs w:val="24"/>
+          <w:rtl/>
+          <w:lang w:val="en-US" w:bidi="he-IL"/>
+        </w:rPr>
         <w:t xml:space="preserve">לא חסרות הסתייגויות. אברהמסון ולינדגרן (2014) הזהירו שהתנועה הופכת לעומס קוגניטיבי כשכללי המשחק מורכבים או כשהתנועה הנדרשת אינה מייצגת את מבנה המושג, וקשב הילד מופנה לביצוע התנועתי על חשבון התוכן. חוסיין ואחרים (2022) ציינו בסקירתם שהמשחקים שימשו לרוב ככלי עזר לתרגול ולאימון, ושלמידה של תוכן חדש לגמרי דרכם הייתה נדירה. שתי ההסתייגויות מעלות שאלה שתחזור בממצאים: לאילו מושגים התנועה מתאימה ולאילו לא.</w:t>
       </w:r>
     </w:p>
@@ -1003,6 +1043,26 @@
           <w:rtl/>
           <w:lang w:val="en-US" w:bidi="he-IL"/>
         </w:rPr>
+        <w:t xml:space="preserve">מן הספרות העברית עולים שני גורמים המתווכים בין דרך ההוראה להישגים. בשארה (2016) השווה בין ארבעים תלמידים עם לקויות למידה בכיתות ג' וד' שלמדו בגישת הכוונה עצמית פעילה, המציבה משימות חקר וייצוג בעזרת המחשות, לבין תלמידים שלמדו בגישה המסורתית, ומצא שיכולת פתרון שאלות אתגר של הראשונים הייתה גבוהה במובהק, ללא הבדל בין בנים לבנות. קולושי-מינסקר (2022) פיתחה מודל לטיפוח הכוונה עצמית בלמידה המשלב את הצרכים הפסיכולוגיים של אוטונומיה, שייכות ויכולת, ובחנה כיצד אימון בו משפר פתרון בעיות מילוליות רב-שלביות בקרב תלמידי בית הספר היסודי. תנעמי ועילם (2021) הוסיפו, אמנם בקרב תלמידי כיתה י"ב, שתפקודים ניהוליים כקשב, עכבה וזיכרון עבודה קשורים להישגים במתמטיקה, ממצא שמעלה את השאלה אם התנועה משפיעה על ההישגים דרך המושג עצמו או דרך הקשב שהיא מגייסת.</w:t>
+      </w:r>
+    </w:p>
+    <w:p>
+      <w:pPr>
+        <w:bidi/>
+        <w:spacing w:after="120" w:before="0" w:line="480"/>
+        <w:jc w:val="both"/>
+      </w:pPr>
+      <w:r>
+        <w:rPr>
+          <w:rFonts w:ascii="Times New Roman" w:cs="David" w:eastAsia="Times New Roman" w:hAnsi="Times New Roman"/>
+          <w:b w:val="false"/>
+          <w:i w:val="false"/>
+          <w:iCs w:val="false"/>
+          <w:sz w:val="24"/>
+          <w:szCs w:val="24"/>
+          <w:rtl/>
+          <w:lang w:val="en-US" w:bidi="he-IL"/>
+        </w:rPr>
         <w:t xml:space="preserve">מהמחקרים עולה שהשפעת התנועה על ההישגים חיובית ברובם, אך מותנית בגורמי עיצוב ובגורמים אישיים שטרם הוסברו די הצורך. הממצא הלא צפוי אצל בק ואחרים (2016) על בעלי ביצוע נמוך, וממצאם של סיוואויה ואחרים (2024) על בעלי מיומנויות מוטוריות נמוכות, אומרים שמשחקי תנועה אינם מרשם אחד שמתאים לכולם.</w:t>
       </w:r>
     </w:p>
@@ -1064,7 +1124,7 @@
           <w:rtl/>
           <w:lang w:val="en-US" w:bidi="he-IL"/>
         </w:rPr>
-        <w:t xml:space="preserve">תיאוריית ההכוונה העצמית מסבירה השפעה זו בכך שמוטיבציה פנימית צומחת כששלושה צרכים פסיכולוגיים בסיסיים באים על סיפוקם: הצורך במסוגלות, הצורך באוטונומיה והצורך בשייכות (Deci &amp; Ryan, 2000). המשחק נותן לתלמיד משוב מיידי על הצלחתו, מאפשר לו לבחור ולהחליט בתוך כלליו, ומעמיד אותו לשחק עם חבריו. ואזו וסקרייד (2017) מצאו שסיפוק הצרכים האלה היה גבוה יותר בקבוצת השיעורים המשולבים בתנועה. בשדה הערבי, מחקרם של ג'ואברה ואחרים (2024) ביקש להכיר את תפקיד המשחקים החינוכיים בהוראת מתמטיקה לתלמידי כיתה ג' בעלי הישגים נמוכים מנקודת מבטם של מוריהם בבתי ספר של אונר"א ברמאללה, ומצא שהמורים משתמשים במשחקים אלה במידה רבה ומעריכים את חשיבותם לעורר מוטיבציה אצל תלמידים בעלי הישגים נמוכים ולשפר את השתתפותם. מחקר זה ייחודי בכך שעסק בנקודת מבטו של המורה, אותה נקודת מבט שהמחקר הנוכחי מאמץ, אף שהשתמש בשאלון כמותי.</w:t>
+        <w:t xml:space="preserve">תיאוריית ההכוונה העצמית מסבירה השפעה זו בכך שמוטיבציה פנימית צומחת כששלושה צרכים פסיכולוגיים בסיסיים באים על סיפוקם: הצורך במסוגלות, הצורך באוטונומיה והצורך בשייכות (Deci &amp; Ryan, 2000). המשחק נותן לתלמיד משוב מיידי על הצלחתו, מאפשר לו לבחור ולהחליט בתוך כלליו, ומעמיד אותו לשחק עם חבריו. ואזו וסקרייד (2017) מצאו שסיפוק הצרכים האלה היה גבוה יותר בקבוצת השיעורים המשולבים בתנועה. ממצאים ישראליים מחזקים את הקשר בין אקלים שיעור משעשע ופעיל לבין מוטיבציה והישגים: בשארה וגזית (2022) בדקו שמונים תלמידי כיתה ו' עם לקויות למידה בכיתות שילוב ומצאו ששילוב הומור בשיעורי מתמטיקה קשור לרמות גבוהות יותר של מוטיבציה ללמידה ושל הישגים מתחילת השנה לסופה, ורוזנברג (2025) מצאה שהטמעת למידה פעילה במרחבי למידה חדשניים הגבירה את המעורבות והיוזמה של הלומדים אך עוררה גם חילוקי דעות ועימות עם תפיסות הוראה מושרשות, ממצא שמזכיר שהשפעתה של למידה פעילה תלויה גם במורה ולא רק בלומד. בשדה הערבי, מחקרם של ג'ואברה ואחרים (2024) ביקש להכיר את תפקיד המשחקים החינוכיים בהוראת מתמטיקה לתלמידי כיתה ג' בעלי הישגים נמוכים מנקודת מבטם של מוריהם בבתי ספר של אונר"א ברמאללה, ומצא שהמורים משתמשים במשחקים אלה במידה רבה ומעריכים את חשיבותם לעורר מוטיבציה אצל תלמידים בעלי הישגים נמוכים ולשפר את השתתפותם. מחקר זה ייחודי בכך שעסק בנקודת מבטו של המורה, אותה נקודת מבט שהמחקר הנוכחי מאמץ, אף שהשתמש בשאלון כמותי.</w:t>
       </w:r>
     </w:p>
     <w:p>
@@ -1105,6 +1165,47 @@
           <w:rtl/>
           <w:lang w:val="en-US" w:bidi="he-IL"/>
         </w:rPr>
+        <w:t xml:space="preserve">המורה כגורם מתווך והכניסה להוראה</w:t>
+      </w:r>
+    </w:p>
+    <w:p>
+      <w:pPr>
+        <w:bidi/>
+        <w:spacing w:after="120" w:before="0" w:line="480"/>
+        <w:jc w:val="both"/>
+      </w:pPr>
+      <w:r>
+        <w:rPr>
+          <w:rFonts w:ascii="Times New Roman" w:cs="David" w:eastAsia="Times New Roman" w:hAnsi="Times New Roman"/>
+          <w:b w:val="false"/>
+          <w:i w:val="false"/>
+          <w:iCs w:val="false"/>
+          <w:sz w:val="24"/>
+          <w:szCs w:val="24"/>
+          <w:rtl/>
+          <w:lang w:val="en-US" w:bidi="he-IL"/>
+        </w:rPr>
+        <w:t xml:space="preserve">הספרות שנסקרה עד כאן עוסקת בתלמיד, אך המחקר הנוכחי שואל את המורות, ולכן ראוי להביא גם את מה שידוע על המורה כגורם. נוטוב (2022) עקבה אחר שתים עשרה מורות למתמטיקה בבית הספר היסודי במהלך חקר שיתופי עם תלמידיהן של נושא מתמטי שלא הכירו, ומצאה שכאשר יחסי הכוחות בכיתה השתנו וכוחן של המורות התרופף מעט, הן גילו עניין מחודש בחקר ופינו מקום להקשיב לקולות התלמידים. שבתאי (2021) תיארה ארבע מורות שעברו תהליך של חקר בהוראת המתמטיקה והראתה כיצד עמדתה של המורה כלפי הידע שלה משנה את הוראתה. שני המחקרים מרמזים שדרך הוראה פעילה משנה לא רק את התלמיד אלא גם את תפקיד המורה, ושהשינוי הזה דורש ביטחון. ביטחון זה חסר במיוחד בכניסה להוראה: זבידאת ואחרים (2022) מצאו שרמת החוסן האישי של מורים מתחילים מהחברה הערבית בישראל גבוהה מזו של מתמחים ושהחוסן קשור לוותק, וויצמן בן-דוד ואחרים (2026) הראו שהשתתפות בקהילות מקצועיות לומדות ייעודיות למחנכות מתחילות במכללה בדרום הארץ תרמה לחוסנן האישי והמקצועי ולעיצוב תפיסת תפקידן. ממצאים אלה יחזרו בפרק הממצאים, כשהמורות יתארו את המורה כגורם המכריע בהצלחת המשחק ואת הליווי בשנה הראשונה כמשאלה המרכזית.</w:t>
+      </w:r>
+    </w:p>
+    <w:p>
+      <w:pPr>
+        <w:pStyle w:val="Heading2"/>
+        <w:keepNext/>
+        <w:bidi/>
+        <w:spacing w:after="120" w:before="200" w:line="480"/>
+        <w:jc w:val="right"/>
+      </w:pPr>
+      <w:r>
+        <w:rPr>
+          <w:rFonts w:ascii="Times New Roman" w:cs="David" w:eastAsia="Times New Roman" w:hAnsi="Times New Roman"/>
+          <w:b/>
+          <w:bCs/>
+          <w:sz w:val="32"/>
+          <w:szCs w:val="36"/>
+          <w:rtl/>
+          <w:lang w:val="en-US" w:bidi="he-IL"/>
+        </w:rPr>
         <w:t xml:space="preserve">הערה על הספרות ומיקום המחקר הנוכחי</w:t>
       </w:r>
     </w:p>
@@ -1125,7 +1226,7 @@
           <w:rtl/>
           <w:lang w:val="en-US" w:bidi="he-IL"/>
         </w:rPr>
-        <w:t xml:space="preserve">הספרות מסכימה שתנועה מספקת אמצעי יעיל ללמידת מתמטיקה בבית הספר היסודי, שההשפעה המוטיבציונית כמעט מובטחת, ושההשפעה על ההישגים חיובית ברוב המחקרים אך מותנית. ניתן להבחין בשני כיוונים: כיוון ניסויי כמותי שמודד את גודל ההשפעה (Beck et al., 2016; Have et al., 2018; Syväoja et al., 2024), וכיוון תיאורי שבוחן תפיסות של מורים ותלמידים (جوابرة وآخرون، 2024; Debrenti, 2024). שלושה פערים עולים מן הסקירה. הראשון, הכיוון הכמותי מזהה שונות בהשפעה ואינו מסביר אותה. השני, רוב המחקרים עסקו בכיתות הנמוכות או במשחקים דיגיטליים, ומשחקי תנועה בכיתות הגבוהות של בית הספר היסודי כמעט נעדרים. השלישי, ההקשר המקומי, בתי הספר הערביים בנגב על כיתותיהם הצפופות ומשאביהם המעטים, לא נחקר בנושא זה. המחקר הנוכחי בא לסגור פערים אלה דרך ניסיונן של מורות שמיישמות משחקי תנועה יום-יום בכיתות הנמוכות והגבוהות, ומבקש להסביר מתי המשחק פועל ומתי לא.</w:t>
+        <w:t xml:space="preserve">הספרות מסכימה שתנועה מספקת אמצעי יעיל ללמידת מתמטיקה בבית הספר היסודי, שההשפעה המוטיבציונית כמעט מובטחת, ושההשפעה על ההישגים חיובית ברוב המחקרים אך מותנית. ניתן להבחין בשני כיוונים: כיוון ניסויי כמותי שמודד את גודל ההשפעה (Beck et al., 2016; Have et al., 2018; Syväoja et al., 2024), וכיוון תיאורי שבוחן תפיסות של מורים ותלמידים (جوابرة وآخرون، 2024; Debrenti, 2024). הספרות העברית העדכנית תורמת כיוון שלישי, שעוסק בעיקר בגיל הרך, בתלמידים עם לקויות למידה ובמורה עצמה (בשארה וגזית, 2022; גלילי, 2025; נוטוב, 2022), אך אינה כוללת מחקר על משחקי תנועה בהוראת המתמטיקה בבית הספר היסודי. שלושה פערים עולים מן הסקירה. הראשון, הכיוון הכמותי מזהה שונות בהשפעה ואינו מסביר אותה. השני, רוב המחקרים עסקו בכיתות הנמוכות או במשחקים דיגיטליים, ומשחקי תנועה בכיתות הגבוהות של בית הספר היסודי כמעט נעדרים. השלישי, ההקשר המקומי, בתי הספר הערביים בנגב על כיתותיהם הצפופות ומשאביהם המעטים, לא נחקר בנושא זה. המחקר הנוכחי בא לסגור פערים אלה דרך ניסיונן של מורות שמיישמות משחקי תנועה יום-יום בכיתות הנמוכות והגבוהות, ומבקש להסביר מתי המשחק פועל ומתי לא.</w:t>
       </w:r>
     </w:p>
     <w:p>
@@ -6582,7 +6683,7 @@
           <w:rtl/>
           <w:lang w:val="en-US" w:bidi="he-IL"/>
         </w:rPr>
-        <w:t xml:space="preserve">גבולות הפישוט שהגדירו המורות מתיישבים עם הערתם של חוסיין ואחרים (2022) שהמשחקים שימשו בעיקר לתרגול ולא ללמידת תוכן חדש, אך סותרים אותה בכיוון חשוב: המורות כאן משתמשות במשחק דווקא "למושג ברגע לידתו", כדברי נג'ווא, ומזהירות מפני שימוש בו לתרגול מיומנות. הסבר אפשרי להבדל הוא שהסקירה של חוסיין ואחרים עסקה במשחקים דיגיטליים, שמתאימים לתרגול חוזר, ואילו משחקי התנועה מתאימים לרגע הראשון של בניית המשמעות. לעקרון "המשחק שמתמודד עם טעות מוגדרת" לא מצאה החוקרת מקבילה מפורשת בספרות שסקרה, וזו אחת התרומות שהמחקר מציע מתוך הפרקטיקה.</w:t>
+        <w:t xml:space="preserve">גבולות הפישוט שהגדירו המורות מתיישבים עם הערתם של חוסיין ואחרים (2022) שהמשחקים שימשו בעיקר לתרגול ולא ללמידת תוכן חדש, אך סותרים אותה בכיוון חשוב: המורות כאן משתמשות במשחק דווקא "למושג ברגע לידתו", כדברי נג'ווא, ומזהירות מפני שימוש בו לתרגול מיומנות. הסבר אפשרי להבדל הוא שהסקירה של חוסיין ואחרים עסקה במשחקים דיגיטליים, שמתאימים לתרגול חוזר, ואילו משחקי התנועה מתאימים לרגע הראשון של בניית המשמעות. לעקרון "המשחק שמתמודד עם טעות מוגדרת" לא מצאה החוקרת מקבילה מפורשת בספרות שסקרה, וזו אחת התרומות שהמחקר מציע מתוך הפרקטיקה. עם זאת, דרישת המורות לגשר כתוב באותו שיעור מתיישבת עם מסקנתם של בן-דוד קוליקנט וברוזה (2014), שמשחק מועיל לתלמידים מתקשים רק כשמלווה אותו מעבר דידקטי עדין מהמוחשי למופשט והפנמת נורמות של למידה של משמעות, ועם ממצאיהן של חסידוב ואילני (2025) על הצורך בייצוג כמותי מוחשי אפילו לסימני היחס הבסיסיים ביותר.</w:t>
       </w:r>
     </w:p>
     <w:p>
@@ -6643,7 +6744,7 @@
           <w:rtl/>
           <w:lang w:val="en-US" w:bidi="he-IL"/>
         </w:rPr>
-        <w:t xml:space="preserve">ממצאים אלה מתיישבים עם המגמה הכללית במחקרים הניסויים, ובייחוד עם מחקרם של האבה ואחרים (2018), מחקרם של ואזו וסקרייד (2017) ומחקרו של אל-חרבי (2026), וממצא שימור הלמידה מתיישב עם מה שמצאו מאווילידי ואחרים (2018) במדידה הדחויה. אך מה שמייחד את ממצאי המחקר הנוכחי הוא שהם מסבירים את מה שאותם מחקרים מודדים. השינוי מטעות מושג לטעות חישוב, שחמש מורות תיארו בניסוחים כמעט זהים, מבהיר מדוע הממוצעים עולים בשאלות מסוימות ולא באחרות, ומדוע ההשפעה נראית מתונה במטא-אנליזות כמו זו של ביון וג'ונג (2018), כאשר מיומנות והבנה נמדדות יחד. סוהא מנסחת את העצה המתודולוגית שמסכמת זאת: "שהחוקר יסתכל על התפלגות הטעויות ולא רק על הממוצע, כי הממוצע מסתיר איפה קרה השינוי".</w:t>
+        <w:t xml:space="preserve">ממצאים אלה מתיישבים עם המגמה הכללית במחקרים הניסויים, ובייחוד עם מחקרם של האבה ואחרים (2018), מחקרם של ואזו וסקרייד (2017) ומחקרו של אל-חרבי (2026), וממצא שימור הלמידה מתיישב עם מה שמצאו מאווילידי ואחרים (2018) במדידה הדחויה. הממצאים מתיישבים גם עם ממצאיו של בשארה (2016) על יתרון ההוראה הפעילה בפתרון שאלות אתגר אצל תלמידים עם לקויות למידה בכיתות ג' וד', ועם המודל של קולושי-מינסקר (2022), שבו ההישג בפתרון בעיות צומח מסיפוק הצרכים באוטונומיה, בשייכות וביכולת. תיאור המורות של ה"תקשיבו" שכמעט נעלם במשחק מזכיר את ממצאם של תנעמי ועילם (2021) על הקשר בין תפקודים ניהוליים להישגים, ומציע שחלק מהשפעת התנועה עובר דרך הקשב. אך מה שמייחד את ממצאי המחקר הנוכחי הוא שהם מסבירים את מה שאותם מחקרים מודדים. השינוי מטעות מושג לטעות חישוב, שחמש מורות תיארו בניסוחים כמעט זהים, מבהיר מדוע הממוצעים עולים בשאלות מסוימות ולא באחרות, ומדוע ההשפעה נראית מתונה במטא-אנליזות כמו זו של ביון וג'ונג (2018), כאשר מיומנות והבנה נמדדות יחד. סוהא מנסחת את העצה המתודולוגית שמסכמת זאת: "שהחוקר יסתכל על התפלגות הטעויות ולא רק על הממוצע, כי הממוצע מסתיר איפה קרה השינוי".</w:t>
       </w:r>
     </w:p>
     <w:p>
@@ -6744,7 +6845,7 @@
           <w:rtl/>
           <w:lang w:val="en-US" w:bidi="he-IL"/>
         </w:rPr>
-        <w:t xml:space="preserve">ההסכמה על ההשפעה המוטיבציונית תואמת את מסקנותיהם של חוסיין ואחרים (2022), דן ואחרים (2024) ווייט ומקוי (2019). את ארבעת המדדים שתיארו המורות אפשר לקרוא לאור תאוריית ההכוונה העצמית (Deci &amp; Ryan, 2000): היוזמה ש"פירושה לעמוד בתור ולא לענות מול כולם" מספקת את הצורך במסוגלות בלי לחשוף את התלמיד לסכנת כישלון פומבי, התפקידים שהתלמידים מנהלים עליהם משא ומתן מספקים את הצורך באוטונומיה, והמשחק הקבוצתי מספק את הצורך בשייכות. אך הממצאים מוסיפים להסבר זה מדד איכותי שהמחקרים הכמותיים לא התמקדו בו: השינוי בסוג השאלות מ"זה נכון?" ל"מה אם?", שהוא מעבר מבקשת אישור לחקירה, ומן הפרוצדורה אל המשמעות. מדד זה קושר את המוטיבציה להבנה במישרין, ומספק תשובה חלקית לשאלה שהספרות הותירה פתוחה, האם מוטיבציה מיתרגמת להישגים: היא מיתרגמת כשהיא מוטיבציה למשמעות, ואינה מיתרגמת כשהיא מוטיבציה לניצחון או ליציאה לחצר.</w:t>
+        <w:t xml:space="preserve">ההסכמה על ההשפעה המוטיבציונית תואמת את מסקנותיהם של חוסיין ואחרים (2022), דן ואחרים (2024) ווייט ומקוי (2019). היא תואמת גם את ממצאיהם של בשארה וגזית (2022), שאקלים שיעור משעשע קשור למוטיבציה ולהישגים גם אצל תלמידי כיתה ו' עם לקויות למידה, ואת ממצאה של רוזנברג (2025), שלמידה פעילה מגבירה מעורבות ויוזמה אך מעמתת את המורה עם תפיסות הוראה מושרשות. את ארבעת המדדים שתיארו המורות אפשר לקרוא לאור תאוריית ההכוונה העצמית (Deci &amp; Ryan, 2000): היוזמה ש"פירושה לעמוד בתור ולא לענות מול כולם" מספקת את הצורך במסוגלות בלי לחשוף את התלמיד לסכנת כישלון פומבי, התפקידים שהתלמידים מנהלים עליהם משא ומתן מספקים את הצורך באוטונומיה, והמשחק הקבוצתי מספק את הצורך בשייכות. אך הממצאים מוסיפים להסבר זה מדד איכותי שהמחקרים הכמותיים לא התמקדו בו: השינוי בסוג השאלות מ"זה נכון?" ל"מה אם?", שהוא מעבר מבקשת אישור לחקירה, ומן הפרוצדורה אל המשמעות. מדד זה קושר את המוטיבציה להבנה במישרין, ומספק תשובה חלקית לשאלה שהספרות הותירה פתוחה, האם מוטיבציה מיתרגמת להישגים: היא מיתרגמת כשהיא מוטיבציה למשמעות, ואינה מיתרגמת כשהיא מוטיבציה לניצחון או ליציאה לחצר.</w:t>
       </w:r>
     </w:p>
     <w:p>
@@ -6765,6 +6866,47 @@
           <w:lang w:val="en-US" w:bidi="he-IL"/>
         </w:rPr>
         <w:t xml:space="preserve">סולם ההשתתפות אצל התלמידים השותקים הוא הממצא שהחוקרת לא מצאה לו מקבילה במחקרים שסקרה, והוא חזר על עצמו באותם הפרטים אצל שמונה המשתתפות: השתתפות שותקת בגוף, אחר כך דיבור עם הקבוצה, אחר כך דיבור מול הכיתה בתוך המשחק, ולבסוף מחוצה לו. מה שהמורות מתארות הוא שמשחק התנועה מאפשר צורת השתתפות שהשיעור הרגיל אינו מאפשר, השתתפות בלי דיבור, ומצורה זו הילד הביישן בונה את ביטחונו מדרגה אחר מדרגה. הממצאים מספקים גם הסבר להבדל בין הכיתות הנמוכות לגבוהות שעליו הצביעו המורות: בכיתות הגבוהות הצורך במסוגלות נעשה רגיש יותר, ולכן התלמיד דוחה "משחק" שעלול להציג אותו כילד ומקבל "אתגר" שנותן לו תפקיד שיש בו סמכות.</w:t>
+      </w:r>
+    </w:p>
+    <w:p>
+      <w:pPr>
+        <w:pStyle w:val="Heading2"/>
+        <w:keepNext/>
+        <w:bidi/>
+        <w:spacing w:after="120" w:before="200" w:line="480"/>
+        <w:jc w:val="right"/>
+      </w:pPr>
+      <w:r>
+        <w:rPr>
+          <w:rFonts w:ascii="Times New Roman" w:cs="David" w:eastAsia="Times New Roman" w:hAnsi="Times New Roman"/>
+          <w:b/>
+          <w:bCs/>
+          <w:sz w:val="32"/>
+          <w:szCs w:val="36"/>
+          <w:rtl/>
+          <w:lang w:val="en-US" w:bidi="he-IL"/>
+        </w:rPr>
+        <w:t xml:space="preserve">מעבר לשאלות המחקר: המורה כתנאי</w:t>
+      </w:r>
+    </w:p>
+    <w:p>
+      <w:pPr>
+        <w:bidi/>
+        <w:spacing w:after="120" w:before="0" w:line="480"/>
+        <w:jc w:val="both"/>
+      </w:pPr>
+      <w:r>
+        <w:rPr>
+          <w:rFonts w:ascii="Times New Roman" w:cs="David" w:eastAsia="Times New Roman" w:hAnsi="Times New Roman"/>
+          <w:b w:val="false"/>
+          <w:i w:val="false"/>
+          <w:iCs w:val="false"/>
+          <w:sz w:val="24"/>
+          <w:szCs w:val="24"/>
+          <w:rtl/>
+          <w:lang w:val="en-US" w:bidi="he-IL"/>
+        </w:rPr>
+        <w:t xml:space="preserve">התמה הרביעית, שהנתונים כפו, מקבלת תמיכה מהספרות העברית שנסקרה. ממצאי המורות שהמשחק עובר דרך המורה תואמים את תיאורה של נוטוב (2022), שדרך הוראה פעילה משנה את יחסי הכוחות בכיתה ודורשת מהמורה לוותר מעט על שליטה, ואת ממצאה של שבתאי (2021) שעמדת המורה כלפי הידע שלה משנה את הוראתה. משאלת המורות לחונכת בשנה הראשונה תואמת את ממצאי זבידאת ואחרים (2022) על החוסן הנמוך יותר בכניסה להוראה בחברה הערבית, ואת ממצאי ויצמן בן-דוד ואחרים (2026) על תרומתן של קהילות לומדות למחנכות מתחילות בדרום הארץ. מה שהמחקר הנוכחי מוסיף הוא זיהוי הרגע שבו הליווי נחוץ ביותר: המשחק הראשון, ולא השנה הראשונה בכללה. הפער שתיארו גיל וזרעיני (2022) בין המודעות לחשיבות התנועה לבין הידע על תרומתה בפועל מקבל כאן מענה חלקי: המורות במחקר זה יודעות בדיוק מה התנועה תורמת, אך ידע זה נבנה מכישלונות ולא הועבר להן בהכשרה.</w:t>
       </w:r>
     </w:p>
     <w:p>
@@ -7260,6 +7402,678 @@
           <w:lang w:val="en-US" w:bidi="he-IL"/>
         </w:rPr>
         <w:t xml:space="preserve">רשימת מקורות</w:t>
+      </w:r>
+    </w:p>
+    <w:p>
+      <w:pPr>
+        <w:bidi/>
+        <w:spacing w:after="160" w:before="0" w:line="480"/>
+        <w:ind w:left="720" w:hanging="720"/>
+        <w:jc w:val="both"/>
+      </w:pPr>
+      <w:r>
+        <w:rPr>
+          <w:rFonts w:ascii="Times New Roman" w:cs="David" w:eastAsia="Times New Roman" w:hAnsi="Times New Roman"/>
+          <w:b w:val="false"/>
+          <w:i w:val="false"/>
+          <w:iCs w:val="false"/>
+          <w:sz w:val="24"/>
+          <w:szCs w:val="24"/>
+          <w:rtl/>
+          <w:lang w:val="en-US" w:bidi="he-IL"/>
+        </w:rPr>
+        <w:t xml:space="preserve">אלגאוי-הרשלר, א', וחמו, פ' (2023). מוח ומתמטיקה: תובנות לאנשי חינוך לגיל הרך. </w:t>
+      </w:r>
+      <w:r>
+        <w:rPr>
+          <w:rFonts w:ascii="Times New Roman" w:cs="David" w:eastAsia="Times New Roman" w:hAnsi="Times New Roman"/>
+          <w:b/>
+          <w:bCs/>
+          <w:i w:val="false"/>
+          <w:iCs w:val="false"/>
+          <w:sz w:val="24"/>
+          <w:szCs w:val="24"/>
+          <w:rtl/>
+          <w:lang w:val="en-US" w:bidi="he-IL"/>
+        </w:rPr>
+        <w:t xml:space="preserve">מחקר ועיון בחינוך מתמטי, 10</w:t>
+      </w:r>
+      <w:r>
+        <w:rPr>
+          <w:rFonts w:ascii="Times New Roman" w:cs="David" w:eastAsia="Times New Roman" w:hAnsi="Times New Roman"/>
+          <w:b w:val="false"/>
+          <w:i w:val="false"/>
+          <w:iCs w:val="false"/>
+          <w:sz w:val="24"/>
+          <w:szCs w:val="24"/>
+          <w:rtl/>
+          <w:lang w:val="en-US" w:bidi="he-IL"/>
+        </w:rPr>
+        <w:t xml:space="preserve">. https://www.shaanan.ac.il/wp-content/uploads/2023/11/אורית-אלגאוי-הרשלר-ופירחה-חמו.pdf</w:t>
+      </w:r>
+    </w:p>
+    <w:p>
+      <w:pPr>
+        <w:bidi/>
+        <w:spacing w:after="160" w:before="0" w:line="480"/>
+        <w:ind w:left="720" w:hanging="720"/>
+        <w:jc w:val="both"/>
+      </w:pPr>
+      <w:r>
+        <w:rPr>
+          <w:rFonts w:ascii="Times New Roman" w:cs="David" w:eastAsia="Times New Roman" w:hAnsi="Times New Roman"/>
+          <w:b w:val="false"/>
+          <w:i w:val="false"/>
+          <w:iCs w:val="false"/>
+          <w:sz w:val="24"/>
+          <w:szCs w:val="24"/>
+          <w:rtl/>
+          <w:lang w:val="en-US" w:bidi="he-IL"/>
+        </w:rPr>
+        <w:t xml:space="preserve">בן-דוד קוליקנט, י', וברוזה, א' (2014). ההשפעות של הוראה מבוססת משחק מחשב על תהליכי למידה של תלמידים מתקשים במתמטיקה. בתוך </w:t>
+      </w:r>
+      <w:r>
+        <w:rPr>
+          <w:rFonts w:ascii="Times New Roman" w:cs="David" w:eastAsia="Times New Roman" w:hAnsi="Times New Roman"/>
+          <w:b/>
+          <w:bCs/>
+          <w:i w:val="false"/>
+          <w:iCs w:val="false"/>
+          <w:sz w:val="24"/>
+          <w:szCs w:val="24"/>
+          <w:rtl/>
+          <w:lang w:val="en-US" w:bidi="he-IL"/>
+        </w:rPr>
+        <w:t xml:space="preserve">האדם הלומד בעידן הטכנולוגי: כנס צ'ייס למחקרי טכנולוגיות למידה</w:t>
+      </w:r>
+      <w:r>
+        <w:rPr>
+          <w:rFonts w:ascii="Times New Roman" w:cs="David" w:eastAsia="Times New Roman" w:hAnsi="Times New Roman"/>
+          <w:b w:val="false"/>
+          <w:i w:val="false"/>
+          <w:iCs w:val="false"/>
+          <w:sz w:val="24"/>
+          <w:szCs w:val="24"/>
+          <w:rtl/>
+          <w:lang w:val="en-US" w:bidi="he-IL"/>
+        </w:rPr>
+        <w:t xml:space="preserve"> (עמ' 29-37). האוניברסיטה הפתוחה ושה"ם.</w:t>
+      </w:r>
+    </w:p>
+    <w:p>
+      <w:pPr>
+        <w:bidi/>
+        <w:spacing w:after="160" w:before="0" w:line="480"/>
+        <w:ind w:left="720" w:hanging="720"/>
+        <w:jc w:val="both"/>
+      </w:pPr>
+      <w:r>
+        <w:rPr>
+          <w:rFonts w:ascii="Times New Roman" w:cs="David" w:eastAsia="Times New Roman" w:hAnsi="Times New Roman"/>
+          <w:b w:val="false"/>
+          <w:i w:val="false"/>
+          <w:iCs w:val="false"/>
+          <w:sz w:val="24"/>
+          <w:szCs w:val="24"/>
+          <w:rtl/>
+          <w:lang w:val="en-US" w:bidi="he-IL"/>
+        </w:rPr>
+        <w:t xml:space="preserve">בשארה, ס' (2016). הכוונה עצמית בהוראת המתמטיקה לתלמידים עם לקויות למידה. </w:t>
+      </w:r>
+      <w:r>
+        <w:rPr>
+          <w:rFonts w:ascii="Times New Roman" w:cs="David" w:eastAsia="Times New Roman" w:hAnsi="Times New Roman"/>
+          <w:b/>
+          <w:bCs/>
+          <w:i w:val="false"/>
+          <w:iCs w:val="false"/>
+          <w:sz w:val="24"/>
+          <w:szCs w:val="24"/>
+          <w:rtl/>
+          <w:lang w:val="en-US" w:bidi="he-IL"/>
+        </w:rPr>
+        <w:t xml:space="preserve">מחקר ועיון בחינוך מתמטי, 3</w:t>
+      </w:r>
+      <w:r>
+        <w:rPr>
+          <w:rFonts w:ascii="Times New Roman" w:cs="David" w:eastAsia="Times New Roman" w:hAnsi="Times New Roman"/>
+          <w:b w:val="false"/>
+          <w:i w:val="false"/>
+          <w:iCs w:val="false"/>
+          <w:sz w:val="24"/>
+          <w:szCs w:val="24"/>
+          <w:rtl/>
+          <w:lang w:val="en-US" w:bidi="he-IL"/>
+        </w:rPr>
+        <w:t xml:space="preserve">, 61-74. http://www.shaanan.ac.il/wp-content/uploads/2019/01/3-gilayon_male-1.pdf</w:t>
+      </w:r>
+    </w:p>
+    <w:p>
+      <w:pPr>
+        <w:bidi/>
+        <w:spacing w:after="160" w:before="0" w:line="480"/>
+        <w:ind w:left="720" w:hanging="720"/>
+        <w:jc w:val="both"/>
+      </w:pPr>
+      <w:r>
+        <w:rPr>
+          <w:rFonts w:ascii="Times New Roman" w:cs="David" w:eastAsia="Times New Roman" w:hAnsi="Times New Roman"/>
+          <w:b w:val="false"/>
+          <w:i w:val="false"/>
+          <w:iCs w:val="false"/>
+          <w:sz w:val="24"/>
+          <w:szCs w:val="24"/>
+          <w:rtl/>
+          <w:lang w:val="en-US" w:bidi="he-IL"/>
+        </w:rPr>
+        <w:t xml:space="preserve">בשארה, ס', וגזית, א' (2022). הומור, מוטיבציה ללמידה ורמת הישגים במקצוע המתמטיקה בקרב תלמידים עם לקויות למידה. </w:t>
+      </w:r>
+      <w:r>
+        <w:rPr>
+          <w:rFonts w:ascii="Times New Roman" w:cs="David" w:eastAsia="Times New Roman" w:hAnsi="Times New Roman"/>
+          <w:b/>
+          <w:bCs/>
+          <w:i w:val="false"/>
+          <w:iCs w:val="false"/>
+          <w:sz w:val="24"/>
+          <w:szCs w:val="24"/>
+          <w:rtl/>
+          <w:lang w:val="en-US" w:bidi="he-IL"/>
+        </w:rPr>
+        <w:t xml:space="preserve">הייעוץ החינוכי, כ"ג</w:t>
+      </w:r>
+      <w:r>
+        <w:rPr>
+          <w:rFonts w:ascii="Times New Roman" w:cs="David" w:eastAsia="Times New Roman" w:hAnsi="Times New Roman"/>
+          <w:b w:val="false"/>
+          <w:i w:val="false"/>
+          <w:iCs w:val="false"/>
+          <w:sz w:val="24"/>
+          <w:szCs w:val="24"/>
+          <w:rtl/>
+          <w:lang w:val="en-US" w:bidi="he-IL"/>
+        </w:rPr>
+        <w:t xml:space="preserve">. https://www.shaanan.ac.il/wp-content/uploads/2022/01/23-7-Bishara-and-Gasit.pdf</w:t>
+      </w:r>
+    </w:p>
+    <w:p>
+      <w:pPr>
+        <w:bidi/>
+        <w:spacing w:after="160" w:before="0" w:line="480"/>
+        <w:ind w:left="720" w:hanging="720"/>
+        <w:jc w:val="both"/>
+      </w:pPr>
+      <w:r>
+        <w:rPr>
+          <w:rFonts w:ascii="Times New Roman" w:cs="David" w:eastAsia="Times New Roman" w:hAnsi="Times New Roman"/>
+          <w:b w:val="false"/>
+          <w:i w:val="false"/>
+          <w:iCs w:val="false"/>
+          <w:sz w:val="24"/>
+          <w:szCs w:val="24"/>
+          <w:rtl/>
+          <w:lang w:val="en-US" w:bidi="he-IL"/>
+        </w:rPr>
+        <w:t xml:space="preserve">גיל, א', וזרעיני, ת' (2022). מודעותן של גננות לחשיבות תנועת הגוף וליציבה הנכונה של ילדי הגן. </w:t>
+      </w:r>
+      <w:r>
+        <w:rPr>
+          <w:rFonts w:ascii="Times New Roman" w:cs="David" w:eastAsia="Times New Roman" w:hAnsi="Times New Roman"/>
+          <w:b/>
+          <w:bCs/>
+          <w:i w:val="false"/>
+          <w:iCs w:val="false"/>
+          <w:sz w:val="24"/>
+          <w:szCs w:val="24"/>
+          <w:rtl/>
+          <w:lang w:val="en-US" w:bidi="he-IL"/>
+        </w:rPr>
+        <w:t xml:space="preserve">רוח הספורט, 8</w:t>
+      </w:r>
+      <w:r>
+        <w:rPr>
+          <w:rFonts w:ascii="Times New Roman" w:cs="David" w:eastAsia="Times New Roman" w:hAnsi="Times New Roman"/>
+          <w:b w:val="false"/>
+          <w:i w:val="false"/>
+          <w:iCs w:val="false"/>
+          <w:sz w:val="24"/>
+          <w:szCs w:val="24"/>
+          <w:rtl/>
+          <w:lang w:val="en-US" w:bidi="he-IL"/>
+        </w:rPr>
+        <w:t xml:space="preserve">, 27-48. https://www.telhai.ac.il/sites/default/files/2023-05/גיל, זרעיני.pdf</w:t>
+      </w:r>
+    </w:p>
+    <w:p>
+      <w:pPr>
+        <w:bidi/>
+        <w:spacing w:after="160" w:before="0" w:line="480"/>
+        <w:ind w:left="720" w:hanging="720"/>
+        <w:jc w:val="both"/>
+      </w:pPr>
+      <w:r>
+        <w:rPr>
+          <w:rFonts w:ascii="Times New Roman" w:cs="David" w:eastAsia="Times New Roman" w:hAnsi="Times New Roman"/>
+          <w:b w:val="false"/>
+          <w:i w:val="false"/>
+          <w:iCs w:val="false"/>
+          <w:sz w:val="24"/>
+          <w:szCs w:val="24"/>
+          <w:rtl/>
+          <w:lang w:val="en-US" w:bidi="he-IL"/>
+        </w:rPr>
+        <w:t xml:space="preserve">גלילי, א' (2025). התערבות במשחק הסוציו-דרמטי לטיפוח ולפיתוח הכישורים הקוגניטיביים והרגשיים-החברתיים. </w:t>
+      </w:r>
+      <w:r>
+        <w:rPr>
+          <w:rFonts w:ascii="Times New Roman" w:cs="David" w:eastAsia="Times New Roman" w:hAnsi="Times New Roman"/>
+          <w:b/>
+          <w:bCs/>
+          <w:i w:val="false"/>
+          <w:iCs w:val="false"/>
+          <w:sz w:val="24"/>
+          <w:szCs w:val="24"/>
+          <w:rtl/>
+          <w:lang w:val="en-US" w:bidi="he-IL"/>
+        </w:rPr>
+        <w:t xml:space="preserve">חוקרים@הגיל הרך, 23</w:t>
+      </w:r>
+      <w:r>
+        <w:rPr>
+          <w:rFonts w:ascii="Times New Roman" w:cs="David" w:eastAsia="Times New Roman" w:hAnsi="Times New Roman"/>
+          <w:b w:val="false"/>
+          <w:i w:val="false"/>
+          <w:iCs w:val="false"/>
+          <w:sz w:val="24"/>
+          <w:szCs w:val="24"/>
+          <w:rtl/>
+          <w:lang w:val="en-US" w:bidi="he-IL"/>
+        </w:rPr>
+        <w:t xml:space="preserve">. https://www.l-w.ac.il/articles/researchers-early-childhood/gilyonot/גיליון-23-חוקריםהגיל-הרך/</w:t>
+      </w:r>
+    </w:p>
+    <w:p>
+      <w:pPr>
+        <w:bidi/>
+        <w:spacing w:after="160" w:before="0" w:line="480"/>
+        <w:ind w:left="720" w:hanging="720"/>
+        <w:jc w:val="both"/>
+      </w:pPr>
+      <w:r>
+        <w:rPr>
+          <w:rFonts w:ascii="Times New Roman" w:cs="David" w:eastAsia="Times New Roman" w:hAnsi="Times New Roman"/>
+          <w:b w:val="false"/>
+          <w:i w:val="false"/>
+          <w:iCs w:val="false"/>
+          <w:sz w:val="24"/>
+          <w:szCs w:val="24"/>
+          <w:rtl/>
+          <w:lang w:val="en-US" w:bidi="he-IL"/>
+        </w:rPr>
+        <w:t xml:space="preserve">ויצמן בן-דוד, ה', הייזמן, א', חנוכה, מ', ושכטר, ח' (2026). אקוסיסטם של חוסן: קהילות מקצועיות לומדות כמעצבות תפיסת תפקיד וחוסן של מחנכות כיתה בזמן מלחמה. </w:t>
+      </w:r>
+      <w:r>
+        <w:rPr>
+          <w:rFonts w:ascii="Times New Roman" w:cs="David" w:eastAsia="Times New Roman" w:hAnsi="Times New Roman"/>
+          <w:b/>
+          <w:bCs/>
+          <w:i w:val="false"/>
+          <w:iCs w:val="false"/>
+          <w:sz w:val="24"/>
+          <w:szCs w:val="24"/>
+          <w:rtl/>
+          <w:lang w:val="en-US" w:bidi="he-IL"/>
+        </w:rPr>
+        <w:t xml:space="preserve">עיונים במינהל ובארגון החינוך, 40</w:t>
+      </w:r>
+      <w:r>
+        <w:rPr>
+          <w:rFonts w:ascii="Times New Roman" w:cs="David" w:eastAsia="Times New Roman" w:hAnsi="Times New Roman"/>
+          <w:b w:val="false"/>
+          <w:i w:val="false"/>
+          <w:iCs w:val="false"/>
+          <w:sz w:val="24"/>
+          <w:szCs w:val="24"/>
+          <w:rtl/>
+          <w:lang w:val="en-US" w:bidi="he-IL"/>
+        </w:rPr>
+        <w:t xml:space="preserve">, 293-325. https://kaye.ac.il/wp-content/uploads/2025/12/1.pdf</w:t>
+      </w:r>
+    </w:p>
+    <w:p>
+      <w:pPr>
+        <w:bidi/>
+        <w:spacing w:after="160" w:before="0" w:line="480"/>
+        <w:ind w:left="720" w:hanging="720"/>
+        <w:jc w:val="both"/>
+      </w:pPr>
+      <w:r>
+        <w:rPr>
+          <w:rFonts w:ascii="Times New Roman" w:cs="David" w:eastAsia="Times New Roman" w:hAnsi="Times New Roman"/>
+          <w:b w:val="false"/>
+          <w:i w:val="false"/>
+          <w:iCs w:val="false"/>
+          <w:sz w:val="24"/>
+          <w:szCs w:val="24"/>
+          <w:rtl/>
+          <w:lang w:val="en-US" w:bidi="he-IL"/>
+        </w:rPr>
+        <w:t xml:space="preserve">זבידאת, א', דלאשה, ו', וח'ליל, ע' (2022). גורמים דמוגרפיים, רגשיים-חברתיים וחינוכיים: חוסן אישי בקרב מורים מתחילים ומתמחים בהוראה מהחברה הערבית בישראל. </w:t>
+      </w:r>
+      <w:r>
+        <w:rPr>
+          <w:rFonts w:ascii="Times New Roman" w:cs="David" w:eastAsia="Times New Roman" w:hAnsi="Times New Roman"/>
+          <w:b/>
+          <w:bCs/>
+          <w:i w:val="false"/>
+          <w:iCs w:val="false"/>
+          <w:sz w:val="24"/>
+          <w:szCs w:val="24"/>
+          <w:rtl/>
+          <w:lang w:val="en-US" w:bidi="he-IL"/>
+        </w:rPr>
+        <w:t xml:space="preserve">דפים, 76</w:t>
+      </w:r>
+      <w:r>
+        <w:rPr>
+          <w:rFonts w:ascii="Times New Roman" w:cs="David" w:eastAsia="Times New Roman" w:hAnsi="Times New Roman"/>
+          <w:b w:val="false"/>
+          <w:i w:val="false"/>
+          <w:iCs w:val="false"/>
+          <w:sz w:val="24"/>
+          <w:szCs w:val="24"/>
+          <w:rtl/>
+          <w:lang w:val="en-US" w:bidi="he-IL"/>
+        </w:rPr>
+        <w:t xml:space="preserve">. https://dapim.mofet.macam.ac.il/article/גורמים-דמוגרפיים-רגשיים-חברתיים-וחינ/</w:t>
+      </w:r>
+    </w:p>
+    <w:p>
+      <w:pPr>
+        <w:bidi/>
+        <w:spacing w:after="160" w:before="0" w:line="480"/>
+        <w:ind w:left="720" w:hanging="720"/>
+        <w:jc w:val="both"/>
+      </w:pPr>
+      <w:r>
+        <w:rPr>
+          <w:rFonts w:ascii="Times New Roman" w:cs="David" w:eastAsia="Times New Roman" w:hAnsi="Times New Roman"/>
+          <w:b w:val="false"/>
+          <w:i w:val="false"/>
+          <w:iCs w:val="false"/>
+          <w:sz w:val="24"/>
+          <w:szCs w:val="24"/>
+          <w:rtl/>
+          <w:lang w:val="en-US" w:bidi="he-IL"/>
+        </w:rPr>
+        <w:t xml:space="preserve">חסידוב, ד', ואילני, ב"ש (2025). הבנות שגויות של סימני היחס בקרב פרחי הוראה לקדם-יסודי ולכיתות א' וב'. </w:t>
+      </w:r>
+      <w:r>
+        <w:rPr>
+          <w:rFonts w:ascii="Times New Roman" w:cs="David" w:eastAsia="Times New Roman" w:hAnsi="Times New Roman"/>
+          <w:b/>
+          <w:bCs/>
+          <w:i w:val="false"/>
+          <w:iCs w:val="false"/>
+          <w:sz w:val="24"/>
+          <w:szCs w:val="24"/>
+          <w:rtl/>
+          <w:lang w:val="en-US" w:bidi="he-IL"/>
+        </w:rPr>
+        <w:t xml:space="preserve">מחקר ועיון בחינוך מתמטי, 11</w:t>
+      </w:r>
+      <w:r>
+        <w:rPr>
+          <w:rFonts w:ascii="Times New Roman" w:cs="David" w:eastAsia="Times New Roman" w:hAnsi="Times New Roman"/>
+          <w:b w:val="false"/>
+          <w:i w:val="false"/>
+          <w:iCs w:val="false"/>
+          <w:sz w:val="24"/>
+          <w:szCs w:val="24"/>
+          <w:rtl/>
+          <w:lang w:val="en-US" w:bidi="he-IL"/>
+        </w:rPr>
+        <w:t xml:space="preserve">. https://www.shaanan.ac.il/wp-content/uploads/2025/08/דינה-חסידוב-בת-שבע-אילני.pdf</w:t>
+      </w:r>
+    </w:p>
+    <w:p>
+      <w:pPr>
+        <w:bidi/>
+        <w:spacing w:after="160" w:before="0" w:line="480"/>
+        <w:ind w:left="720" w:hanging="720"/>
+        <w:jc w:val="both"/>
+      </w:pPr>
+      <w:r>
+        <w:rPr>
+          <w:rFonts w:ascii="Times New Roman" w:cs="David" w:eastAsia="Times New Roman" w:hAnsi="Times New Roman"/>
+          <w:b w:val="false"/>
+          <w:i w:val="false"/>
+          <w:iCs w:val="false"/>
+          <w:sz w:val="24"/>
+          <w:szCs w:val="24"/>
+          <w:rtl/>
+          <w:lang w:val="en-US" w:bidi="he-IL"/>
+        </w:rPr>
+        <w:t xml:space="preserve">נוטוב, ל' (2022). אפיון תפיסות של מורים את יחסי הכוחות בכיתה במהלך חקר שיתופי של מורים ותלמידים. </w:t>
+      </w:r>
+      <w:r>
+        <w:rPr>
+          <w:rFonts w:ascii="Times New Roman" w:cs="David" w:eastAsia="Times New Roman" w:hAnsi="Times New Roman"/>
+          <w:b/>
+          <w:bCs/>
+          <w:i w:val="false"/>
+          <w:iCs w:val="false"/>
+          <w:sz w:val="24"/>
+          <w:szCs w:val="24"/>
+          <w:rtl/>
+          <w:lang w:val="en-US" w:bidi="he-IL"/>
+        </w:rPr>
+        <w:t xml:space="preserve">דפים, 76</w:t>
+      </w:r>
+      <w:r>
+        <w:rPr>
+          <w:rFonts w:ascii="Times New Roman" w:cs="David" w:eastAsia="Times New Roman" w:hAnsi="Times New Roman"/>
+          <w:b w:val="false"/>
+          <w:i w:val="false"/>
+          <w:iCs w:val="false"/>
+          <w:sz w:val="24"/>
+          <w:szCs w:val="24"/>
+          <w:rtl/>
+          <w:lang w:val="en-US" w:bidi="he-IL"/>
+        </w:rPr>
+        <w:t xml:space="preserve">. https://dapim.mofet.macam.ac.il/wp-content/uploads/2021/10/אפיון-תפיסות-של-מורים-את-יחסי-הכוחות-בכיתה.pdf</w:t>
+      </w:r>
+    </w:p>
+    <w:p>
+      <w:pPr>
+        <w:bidi/>
+        <w:spacing w:after="160" w:before="0" w:line="480"/>
+        <w:ind w:left="720" w:hanging="720"/>
+        <w:jc w:val="both"/>
+      </w:pPr>
+      <w:r>
+        <w:rPr>
+          <w:rFonts w:ascii="Times New Roman" w:cs="David" w:eastAsia="Times New Roman" w:hAnsi="Times New Roman"/>
+          <w:b w:val="false"/>
+          <w:i w:val="false"/>
+          <w:iCs w:val="false"/>
+          <w:sz w:val="24"/>
+          <w:szCs w:val="24"/>
+          <w:rtl/>
+          <w:lang w:val="en-US" w:bidi="he-IL"/>
+        </w:rPr>
+        <w:t xml:space="preserve">קולושי-מינסקר, ע' (2022). מודל טיפוח הכוונה עצמית להעלאת הישגים בפתרון בעיות מילוליות במתמטיקה. </w:t>
+      </w:r>
+      <w:r>
+        <w:rPr>
+          <w:rFonts w:ascii="Times New Roman" w:cs="David" w:eastAsia="Times New Roman" w:hAnsi="Times New Roman"/>
+          <w:b/>
+          <w:bCs/>
+          <w:i w:val="false"/>
+          <w:iCs w:val="false"/>
+          <w:sz w:val="24"/>
+          <w:szCs w:val="24"/>
+          <w:rtl/>
+          <w:lang w:val="en-US" w:bidi="he-IL"/>
+        </w:rPr>
+        <w:t xml:space="preserve">מחקר ועיון בחינוך מתמטי, 9</w:t>
+      </w:r>
+      <w:r>
+        <w:rPr>
+          <w:rFonts w:ascii="Times New Roman" w:cs="David" w:eastAsia="Times New Roman" w:hAnsi="Times New Roman"/>
+          <w:b w:val="false"/>
+          <w:i w:val="false"/>
+          <w:iCs w:val="false"/>
+          <w:sz w:val="24"/>
+          <w:szCs w:val="24"/>
+          <w:rtl/>
+          <w:lang w:val="en-US" w:bidi="he-IL"/>
+        </w:rPr>
+        <w:t xml:space="preserve">. https://www.shaanan.ac.il/wp-content/uploads/2023/01/inbal.pdf</w:t>
+      </w:r>
+    </w:p>
+    <w:p>
+      <w:pPr>
+        <w:bidi/>
+        <w:spacing w:after="160" w:before="0" w:line="480"/>
+        <w:ind w:left="720" w:hanging="720"/>
+        <w:jc w:val="both"/>
+      </w:pPr>
+      <w:r>
+        <w:rPr>
+          <w:rFonts w:ascii="Times New Roman" w:cs="David" w:eastAsia="Times New Roman" w:hAnsi="Times New Roman"/>
+          <w:b w:val="false"/>
+          <w:i w:val="false"/>
+          <w:iCs w:val="false"/>
+          <w:sz w:val="24"/>
+          <w:szCs w:val="24"/>
+          <w:rtl/>
+          <w:lang w:val="en-US" w:bidi="he-IL"/>
+        </w:rPr>
+        <w:t xml:space="preserve">רוזנברג, ש' (2025). למידה פעילה, מעורבות סטודנטים והתמודדות עם תפיסות הוראה ולמידה: הזדמנויות ואתגרים שמזמנים מרחבי למידה במכללה להוראה. </w:t>
+      </w:r>
+      <w:r>
+        <w:rPr>
+          <w:rFonts w:ascii="Times New Roman" w:cs="David" w:eastAsia="Times New Roman" w:hAnsi="Times New Roman"/>
+          <w:b/>
+          <w:bCs/>
+          <w:i w:val="false"/>
+          <w:iCs w:val="false"/>
+          <w:sz w:val="24"/>
+          <w:szCs w:val="24"/>
+          <w:rtl/>
+          <w:lang w:val="en-US" w:bidi="he-IL"/>
+        </w:rPr>
+        <w:t xml:space="preserve">חמדעת, י"ח</w:t>
+      </w:r>
+      <w:r>
+        <w:rPr>
+          <w:rFonts w:ascii="Times New Roman" w:cs="David" w:eastAsia="Times New Roman" w:hAnsi="Times New Roman"/>
+          <w:b w:val="false"/>
+          <w:i w:val="false"/>
+          <w:iCs w:val="false"/>
+          <w:sz w:val="24"/>
+          <w:szCs w:val="24"/>
+          <w:rtl/>
+          <w:lang w:val="en-US" w:bidi="he-IL"/>
+        </w:rPr>
+        <w:t xml:space="preserve">. https://www.hemdat.ac.il/wp-content/uploads/2025/08/כרך-יח-סופי.pdf</w:t>
+      </w:r>
+    </w:p>
+    <w:p>
+      <w:pPr>
+        <w:bidi/>
+        <w:spacing w:after="160" w:before="0" w:line="480"/>
+        <w:ind w:left="720" w:hanging="720"/>
+        <w:jc w:val="both"/>
+      </w:pPr>
+      <w:r>
+        <w:rPr>
+          <w:rFonts w:ascii="Times New Roman" w:cs="David" w:eastAsia="Times New Roman" w:hAnsi="Times New Roman"/>
+          <w:b w:val="false"/>
+          <w:i w:val="false"/>
+          <w:iCs w:val="false"/>
+          <w:sz w:val="24"/>
+          <w:szCs w:val="24"/>
+          <w:rtl/>
+          <w:lang w:val="en-US" w:bidi="he-IL"/>
+        </w:rPr>
+        <w:t xml:space="preserve">שבתאי, ג' (2021). על ארבע מורות וחקר בהוראת המתמטיקה. </w:t>
+      </w:r>
+      <w:r>
+        <w:rPr>
+          <w:rFonts w:ascii="Times New Roman" w:cs="David" w:eastAsia="Times New Roman" w:hAnsi="Times New Roman"/>
+          <w:b/>
+          <w:bCs/>
+          <w:i w:val="false"/>
+          <w:iCs w:val="false"/>
+          <w:sz w:val="24"/>
+          <w:szCs w:val="24"/>
+          <w:rtl/>
+          <w:lang w:val="en-US" w:bidi="he-IL"/>
+        </w:rPr>
+        <w:t xml:space="preserve">מחקר ועיון בחינוך מתמטי, 8</w:t>
+      </w:r>
+      <w:r>
+        <w:rPr>
+          <w:rFonts w:ascii="Times New Roman" w:cs="David" w:eastAsia="Times New Roman" w:hAnsi="Times New Roman"/>
+          <w:b w:val="false"/>
+          <w:i w:val="false"/>
+          <w:iCs w:val="false"/>
+          <w:sz w:val="24"/>
+          <w:szCs w:val="24"/>
+          <w:rtl/>
+          <w:lang w:val="en-US" w:bidi="he-IL"/>
+        </w:rPr>
+        <w:t xml:space="preserve">. https://www.shaanan.ac.il/wp-content/uploads/2021/04/shabtay.pdf</w:t>
+      </w:r>
+    </w:p>
+    <w:p>
+      <w:pPr>
+        <w:bidi/>
+        <w:spacing w:after="160" w:before="0" w:line="480"/>
+        <w:ind w:left="720" w:hanging="720"/>
+        <w:jc w:val="both"/>
+      </w:pPr>
+      <w:r>
+        <w:rPr>
+          <w:rFonts w:ascii="Times New Roman" w:cs="David" w:eastAsia="Times New Roman" w:hAnsi="Times New Roman"/>
+          <w:b w:val="false"/>
+          <w:i w:val="false"/>
+          <w:iCs w:val="false"/>
+          <w:sz w:val="24"/>
+          <w:szCs w:val="24"/>
+          <w:rtl/>
+          <w:lang w:val="en-US" w:bidi="he-IL"/>
+        </w:rPr>
+        <w:t xml:space="preserve">תנעמי, י', ועילם, א' (2021). הקשר בין תפקודים ניהוליים להישגים במתמטיקה בקרב תלמידי כיתה י"ב. </w:t>
+      </w:r>
+      <w:r>
+        <w:rPr>
+          <w:rFonts w:ascii="Times New Roman" w:cs="David" w:eastAsia="Times New Roman" w:hAnsi="Times New Roman"/>
+          <w:b/>
+          <w:bCs/>
+          <w:i w:val="false"/>
+          <w:iCs w:val="false"/>
+          <w:sz w:val="24"/>
+          <w:szCs w:val="24"/>
+          <w:rtl/>
+          <w:lang w:val="en-US" w:bidi="he-IL"/>
+        </w:rPr>
+        <w:t xml:space="preserve">מחקר ועיון בחינוך מתמטי, 8</w:t>
+      </w:r>
+      <w:r>
+        <w:rPr>
+          <w:rFonts w:ascii="Times New Roman" w:cs="David" w:eastAsia="Times New Roman" w:hAnsi="Times New Roman"/>
+          <w:b w:val="false"/>
+          <w:i w:val="false"/>
+          <w:iCs w:val="false"/>
+          <w:sz w:val="24"/>
+          <w:szCs w:val="24"/>
+          <w:rtl/>
+          <w:lang w:val="en-US" w:bidi="he-IL"/>
+        </w:rPr>
+        <w:t xml:space="preserve">, 73-81. https://www.shaanan.ac.il/wp-content/uploads/2021/02/tanami_eylam-1.pdf</w:t>
       </w:r>
     </w:p>
     <w:p>

</xml_diff>

<commit_message>
Correct Shabtay (2021) description and add verified page numbers
Verified four Hebrew sources against their PDFs: fixed the account of
Shabtay's study, tightened the Algawi-Hershler and Hamo wording, and
added page ranges for four references.

Co-Authored-By: Claude Fable 5.1 <noreply@anthropic.com>
Claude-Session: https://claude.ai/code/session_01KzGBsiV6nnPrrZTki3wcT1
</commit_message>
<xml_diff>
--- a/papers/kinesthetic-games-math-primary/kinesthetic-games-seminar-he.docx
+++ b/papers/kinesthetic-games-math-primary/kinesthetic-games-seminar-he.docx
@@ -821,7 +821,7 @@
           <w:rtl/>
           <w:lang w:val="en-US" w:bidi="he-IL"/>
         </w:rPr>
-        <w:t xml:space="preserve">בספרות העברית העדכנית נמצא אותו קו מחשבה בשלושה מוקדים. אלגאוי-הרשלר וחמו (2023) מסכמות לאנשי חינוך לגיל הרך ידע נוירופדגוגי על התפתחות היכולת המתמטית ומנסחות עקרונות הוראה שבמרכזם למידה דרך החושים ודרך משחק אינטואיטיבי, ומציגות משחקים כמו דומינו וקוביות משחק כמודלים כמותיים מובנים שתומכים בקליטת כמויות ובייצוגן בזיכרון. גלילי (2025) מתעדת התערבות במשחק הסוציו-דרמטי בגני ילדים ומראה שתיווך פעיל במשחק מקדם כישורים קוגניטיביים ורגשיים-חברתיים, כלומר שהמשחק אינו רק מסגרת נעימה אלא מנגנון למידה שאפשר לתכנן. גיל וזרעיני (2022) מצאו בראיונות עם גננות מודעות גבוהה לחשיבות התנועה בשגרת הגן לצד ידע מועט על מה שהתנועה תורמת בפועל, פער שיחזור, כפי שיתברר, גם אצל מורות בית הספר היסודי.</w:t>
+        <w:t xml:space="preserve">בספרות העברית העדכנית נמצא אותו קו מחשבה בשלושה מוקדים. אלגאוי-הרשלר וחמו (2023) מסכמות לאנשי חינוך לגיל הרך ידע נוירופדגוגי על התפתחות היכולת המתמטית ומנסחות עקרונות הוראה שבמרכזם למידה דרך החושים ודרך משחק אינטואיטיבי, ומציינות שמשחקי התאמה כמו דומינו ומשחקים עם קוביות משחק מפתחים את יכולת תפיסת הכמות במבט אחד, שהיא בסיס להבנת מספרים ופעולות. גלילי (2025) מתעדת התערבות במשחק הסוציו-דרמטי בגני ילדים ומראה שתיווך פעיל במשחק מקדם כישורים קוגניטיביים ורגשיים-חברתיים, כלומר שהמשחק אינו רק מסגרת נעימה אלא מנגנון למידה שאפשר לתכנן. גיל וזרעיני (2022) מצאו בראיונות עם גננות מודעות גבוהה לחשיבות התנועה בשגרת הגן לצד ידע מועט על מה שהתנועה תורמת בפועל, פער שיחזור, כפי שיתברר, גם אצל מורות בית הספר היסודי.</w:t>
       </w:r>
     </w:p>
     <w:p>
@@ -1185,7 +1185,7 @@
           <w:rtl/>
           <w:lang w:val="en-US" w:bidi="he-IL"/>
         </w:rPr>
-        <w:t xml:space="preserve">הספרות שנסקרה עד כאן עוסקת בתלמיד, אך המחקר הנוכחי שואל את המורות, ולכן ראוי להביא גם את מה שידוע על המורה כגורם. נוטוב (2022) עקבה אחר שתים עשרה מורות למתמטיקה בבית הספר היסודי במהלך חקר שיתופי עם תלמידיהן של נושא מתמטי שלא הכירו, ומצאה שכאשר יחסי הכוחות בכיתה השתנו וכוחן של המורות התרופף מעט, הן גילו עניין מחודש בחקר ופינו מקום להקשיב לקולות התלמידים. שבתאי (2021) תיארה ארבע מורות שעברו תהליך של חקר בהוראת המתמטיקה והראתה כיצד עמדתה של המורה כלפי הידע שלה משנה את הוראתה. שני המחקרים מרמזים שדרך הוראה פעילה משנה לא רק את התלמיד אלא גם את תפקיד המורה, ושהשינוי הזה דורש ביטחון. ביטחון זה חסר במיוחד בכניסה להוראה: זבידאת ואחרים (2022) מצאו שרמת החוסן האישי של מורים מתחילים מהחברה הערבית בישראל גבוהה מזו של מתמחים ושהחוסן קשור לוותק, וויצמן בן-דוד ואחרים (2026) הראו שהשתתפות בקהילות מקצועיות לומדות ייעודיות למחנכות מתחילות במכללה בדרום הארץ תרמה לחוסנן האישי והמקצועי ולעיצוב תפיסת תפקידן. ממצאים אלה יחזרו בפרק הממצאים, כשהמורות יתארו את המורה כגורם המכריע בהצלחת המשחק ואת הליווי בשנה הראשונה כמשאלה המרכזית.</w:t>
+        <w:t xml:space="preserve">הספרות שנסקרה עד כאן עוסקת בתלמיד, אך המחקר הנוכחי שואל את המורות, ולכן ראוי להביא גם את מה שידוע על המורה כגורם. נוטוב (2022) עקבה אחר שתים עשרה מורות למתמטיקה בבית הספר היסודי במהלך חקר שיתופי עם תלמידיהן של נושא מתמטי שלא הכירו, ומצאה שכאשר יחסי הכוחות בכיתה השתנו וכוחן של המורות התרופף מעט, הן גילו עניין מחודש בחקר ופינו מקום להקשיב לקולות התלמידים. שבתאי (2021) ראיינה ארבע מורות למתמטיקה על עברן כלומדות ועל יחסן להוראה חקירתית לעומת הוראה מסורתית, ומצאה שההיסטוריה הקשה שלהן כלומדות מתמטיקה היא הבסיס לשיח הפדגוגי שלהן ולהזדהותן עם סגנון הוראה, ושבסיפוריהן חוזר צורך ב"תיקון" של ההוראה שהן עצמן קיבלו. שני המחקרים מרמזים שדרך ההוראה של המורה קשורה לזהותה ולעברה כלומדת, ושמעבר להוראה פעילה משנה גם את תפקיד המורה ודורש ביטחון. ביטחון זה חסר במיוחד בכניסה להוראה: זבידאת ואחרים (2022) מצאו שרמת החוסן האישי של מורים מתחילים מהחברה הערבית בישראל גבוהה מזו של מתמחים ושהחוסן קשור לוותק, וויצמן בן-דוד ואחרים (2026) הראו שהשתתפות בקהילות מקצועיות לומדות ייעודיות למחנכות מתחילות במכללה בדרום הארץ תרמה לחוסנן האישי והמקצועי ולעיצוב תפיסת תפקידן. ממצאים אלה יחזרו בפרק הממצאים, כשהמורות יתארו את המורה כגורם המכריע בהצלחת המשחק ואת הליווי בשנה הראשונה כמשאלה המרכזית.</w:t>
       </w:r>
     </w:p>
     <w:p>
@@ -6906,7 +6906,7 @@
           <w:rtl/>
           <w:lang w:val="en-US" w:bidi="he-IL"/>
         </w:rPr>
-        <w:t xml:space="preserve">התמה הרביעית, שהנתונים כפו, מקבלת תמיכה מהספרות העברית שנסקרה. ממצאי המורות שהמשחק עובר דרך המורה תואמים את תיאורה של נוטוב (2022), שדרך הוראה פעילה משנה את יחסי הכוחות בכיתה ודורשת מהמורה לוותר מעט על שליטה, ואת ממצאה של שבתאי (2021) שעמדת המורה כלפי הידע שלה משנה את הוראתה. משאלת המורות לחונכת בשנה הראשונה תואמת את ממצאי זבידאת ואחרים (2022) על החוסן הנמוך יותר בכניסה להוראה בחברה הערבית, ואת ממצאי ויצמן בן-דוד ואחרים (2026) על תרומתן של קהילות לומדות למחנכות מתחילות בדרום הארץ. מה שהמחקר הנוכחי מוסיף הוא זיהוי הרגע שבו הליווי נחוץ ביותר: המשחק הראשון, ולא השנה הראשונה בכללה. הפער שתיארו גיל וזרעיני (2022) בין המודעות לחשיבות התנועה לבין הידע על תרומתה בפועל מקבל כאן מענה חלקי: המורות במחקר זה יודעות בדיוק מה התנועה תורמת, אך ידע זה נבנה מכישלונות ולא הועבר להן בהכשרה.</w:t>
+        <w:t xml:space="preserve">התמה הרביעית, שהנתונים כפו, מקבלת תמיכה מהספרות העברית שנסקרה. ממצאי המורות שהמשחק עובר דרך המורה תואמים את תיאורה של נוטוב (2022), שדרך הוראה פעילה משנה את יחסי הכוחות בכיתה ודורשת מהמורה לוותר מעט על שליטה, ואת ממצאה של שבתאי (2021) שעברן של המורות כלומדות מתמטיקה מעצב את השיח הפדגוגי שלהן, ממצא שמהדהד בדרך שבה המורות במחקר זה תיארו את מקור אמונתן במשחק: התנסות מכוננת עם תלמיד אחד, ולא הכשרה. משאלת המורות לחונכת בשנה הראשונה תואמת את ממצאי זבידאת ואחרים (2022) על החוסן הנמוך יותר בכניסה להוראה בחברה הערבית, ואת ממצאי ויצמן בן-דוד ואחרים (2026) על תרומתן של קהילות לומדות למחנכות מתחילות בדרום הארץ. מה שהמחקר הנוכחי מוסיף הוא זיהוי הרגע שבו הליווי נחוץ ביותר: המשחק הראשון, ולא השנה הראשונה בכללה. הפער שתיארו גיל וזרעיני (2022) בין המודעות לחשיבות התנועה לבין הידע על תרומתה בפועל מקבל כאן מענה חלקי: המורות במחקר זה יודעות בדיוק מה התנועה תורמת, אך ידע זה נבנה מכישלונות ולא הועבר להן בהכשרה.</w:t>
       </w:r>
     </w:p>
     <w:p>
@@ -7449,7 +7449,7 @@
           <w:rtl/>
           <w:lang w:val="en-US" w:bidi="he-IL"/>
         </w:rPr>
-        <w:t xml:space="preserve">. https://www.shaanan.ac.il/wp-content/uploads/2023/11/אורית-אלגאוי-הרשלר-ופירחה-חמו.pdf</w:t>
+        <w:t xml:space="preserve">, 22-34. https://www.shaanan.ac.il/wp-content/uploads/2023/11/אורית-אלגאוי-הרשלר-ופירחה-חמו.pdf</w:t>
       </w:r>
     </w:p>
     <w:p>
@@ -7785,7 +7785,7 @@
           <w:rtl/>
           <w:lang w:val="en-US" w:bidi="he-IL"/>
         </w:rPr>
-        <w:t xml:space="preserve">. https://dapim.mofet.macam.ac.il/article/גורמים-דמוגרפיים-רגשיים-חברתיים-וחינ/</w:t>
+        <w:t xml:space="preserve">, 57-77. https://dapim.mofet.macam.ac.il/article/גורמים-דמוגרפיים-רגשיים-חברתיים-וחינ/</w:t>
       </w:r>
     </w:p>
     <w:p>
@@ -7833,7 +7833,7 @@
           <w:rtl/>
           <w:lang w:val="en-US" w:bidi="he-IL"/>
         </w:rPr>
-        <w:t xml:space="preserve">. https://www.shaanan.ac.il/wp-content/uploads/2025/08/דינה-חסידוב-בת-שבע-אילני.pdf</w:t>
+        <w:t xml:space="preserve">, 100-113. https://www.shaanan.ac.il/wp-content/uploads/2025/08/דינה-חסידוב-בת-שבע-אילני.pdf</w:t>
       </w:r>
     </w:p>
     <w:p>
@@ -8025,7 +8025,7 @@
           <w:rtl/>
           <w:lang w:val="en-US" w:bidi="he-IL"/>
         </w:rPr>
-        <w:t xml:space="preserve">. https://www.shaanan.ac.il/wp-content/uploads/2021/04/shabtay.pdf</w:t>
+        <w:t xml:space="preserve">, 63-72. https://www.shaanan.ac.il/wp-content/uploads/2021/04/shabtay.pdf</w:t>
       </w:r>
     </w:p>
     <w:p>

</xml_diff>